<commit_message>
feat(enterprise): add digital employee domains and skill runtime
</commit_message>
<xml_diff>
--- a/skills/public/research-fund-settlement/assets/reference-examples/group-company-example.docx
+++ b/skills/public/research-fund-settlement/assets/reference-examples/group-company-example.docx
@@ -85,6 +85,7 @@
           <w:highlight w:val="yellow"/>
         </w:rPr>
       </w:pPr>
+      <w:commentRangeStart w:id="0"/>
       <w:r>
         <w:rPr>
           <w:rFonts w:hint="eastAsia" w:ascii="黑体" w:eastAsia="黑体"/>
@@ -137,6 +138,10 @@
         </w:rPr>
         <w:t>中国海洋石油有限公司</w:t>
       </w:r>
+      <w:commentRangeEnd w:id="0"/>
+      <w:r>
+        <w:commentReference w:id="0"/>
+      </w:r>
     </w:p>
     <w:p>
       <w:pPr>
@@ -218,7 +223,7 @@
         <w:drawing>
           <wp:inline distT="0" distB="0" distL="0" distR="0">
             <wp:extent cx="1144905" cy="1051560"/>
-            <wp:effectExtent l="0" t="0" r="17145" b="15240"/>
+            <wp:effectExtent l="0" t="0" r="0" b="0"/>
             <wp:docPr id="13" name="图片 13" descr="logo1"/>
             <wp:cNvGraphicFramePr>
               <a:graphicFrameLocks xmlns:a="http://schemas.openxmlformats.org/drawingml/2006/main" noChangeAspect="1"/>
@@ -348,6 +353,7 @@
         </w:rPr>
         <w:t>承 担 单 位：</w:t>
       </w:r>
+      <w:commentRangeStart w:id="1"/>
       <w:r>
         <w:rPr>
           <w:rFonts w:hint="eastAsia"/>
@@ -359,6 +365,10 @@
         </w:rPr>
         <w:t>中海油研究总院有限责任公司/中海石油（中国）有限公司北京研究中心</w:t>
       </w:r>
+      <w:commentRangeEnd w:id="1"/>
+      <w:r>
+        <w:commentReference w:id="1"/>
+      </w:r>
     </w:p>
     <w:p>
       <w:pPr>
@@ -539,6 +549,7 @@
           <w:szCs w:val="28"/>
         </w:rPr>
       </w:pPr>
+      <w:commentRangeStart w:id="2"/>
       <w:r>
         <w:rPr>
           <w:b/>
@@ -555,6 +566,10 @@
           <w:szCs w:val="28"/>
         </w:rPr>
         <w:t>年 月 日</w:t>
+      </w:r>
+      <w:commentRangeEnd w:id="2"/>
+      <w:r>
+        <w:commentReference w:id="2"/>
       </w:r>
     </w:p>
     <w:p>
@@ -1202,11 +1217,11 @@
     </w:p>
     <w:p>
       <w:pPr>
-        <w:pStyle w:val="9"/>
+        <w:pStyle w:val="13"/>
         <w:widowControl/>
         <w:numPr>
           <w:ilvl w:val="0"/>
-          <w:numId w:val="1"/>
+          <w:numId w:val="4"/>
         </w:numPr>
         <w:spacing w:before="48" w:beforeLines="20" w:line="264" w:lineRule="auto"/>
         <w:ind w:left="426" w:right="-86" w:rightChars="-41" w:hanging="284" w:firstLineChars="0"/>
@@ -1352,11 +1367,11 @@
     </w:p>
     <w:p>
       <w:pPr>
-        <w:pStyle w:val="9"/>
+        <w:pStyle w:val="13"/>
         <w:widowControl/>
         <w:numPr>
           <w:ilvl w:val="0"/>
-          <w:numId w:val="1"/>
+          <w:numId w:val="4"/>
         </w:numPr>
         <w:spacing w:before="48" w:beforeLines="20" w:line="264" w:lineRule="auto"/>
         <w:ind w:left="426" w:right="-86" w:rightChars="-41" w:hanging="284" w:firstLineChars="0"/>
@@ -2390,6 +2405,7 @@
         </w:rPr>
         <w:t>决算报告是严格依照</w:t>
       </w:r>
+      <w:commentRangeStart w:id="3"/>
       <w:r>
         <w:rPr>
           <w:rFonts w:hint="eastAsia"/>
@@ -2411,6 +2427,10 @@
         </w:rPr>
         <w:t>/有限公司</w:t>
       </w:r>
+      <w:commentRangeEnd w:id="3"/>
+      <w:r>
+        <w:commentReference w:id="3"/>
+      </w:r>
       <w:r>
         <w:rPr>
           <w:rFonts w:hint="eastAsia"/>
@@ -2785,6 +2805,7 @@
         </w:rPr>
         <w:tab/>
       </w:r>
+      <w:commentRangeStart w:id="4"/>
       <w:r>
         <w:rPr>
           <w:rFonts w:hint="eastAsia"/>
@@ -2795,6 +2816,10 @@
         </w:rPr>
         <w:t>集团公司/有限公司</w:t>
       </w:r>
+      <w:commentRangeEnd w:id="4"/>
+      <w:r>
+        <w:commentReference w:id="4"/>
+      </w:r>
       <w:r>
         <w:rPr>
           <w:rFonts w:hint="eastAsia"/>
@@ -2878,7 +2903,7 @@
       <w:pPr>
         <w:numPr>
           <w:ilvl w:val="0"/>
-          <w:numId w:val="2"/>
+          <w:numId w:val="5"/>
         </w:numPr>
         <w:tabs>
           <w:tab w:val="left" w:pos="630"/>
@@ -2899,494 +2924,7 @@
           <w:sz w:val="24"/>
           <w:szCs w:val="28"/>
         </w:rPr>
-        <w:t>科技项目（课题）经费</w:t>
-      </w:r>
-      <w:commentRangeStart w:id="0"/>
-      <w:r>
-        <w:rPr>
-          <w:rFonts w:hint="eastAsia" w:ascii="Calibri" w:hAnsi="Calibri"/>
-          <w:b/>
-          <w:sz w:val="24"/>
-          <w:szCs w:val="28"/>
-        </w:rPr>
-        <w:t>概预算</w:t>
-      </w:r>
-      <w:commentRangeEnd w:id="0"/>
-      <w:r>
-        <w:commentReference w:id="0"/>
-      </w:r>
-      <w:r>
-        <w:rPr>
-          <w:rFonts w:hint="eastAsia" w:ascii="Calibri" w:hAnsi="Calibri"/>
-          <w:b/>
-          <w:sz w:val="24"/>
-          <w:szCs w:val="28"/>
-        </w:rPr>
-        <w:t>基本情况</w:t>
-      </w:r>
-    </w:p>
-    <w:p>
-      <w:pPr>
-        <w:numPr>
-          <w:ilvl w:val="0"/>
-          <w:numId w:val="3"/>
-        </w:numPr>
-        <w:spacing w:line="360" w:lineRule="auto"/>
-        <w:ind w:left="420" w:leftChars="200"/>
-        <w:rPr>
-          <w:rFonts w:hint="eastAsia" w:ascii="宋体" w:hAnsi="宋体"/>
-          <w:sz w:val="24"/>
-        </w:rPr>
-      </w:pPr>
-      <w:r>
-        <w:rPr>
-          <w:rFonts w:hint="eastAsia" w:ascii="宋体" w:hAnsi="宋体"/>
-          <w:sz w:val="24"/>
-        </w:rPr>
-        <w:t>概预算批准情况</w:t>
-      </w:r>
-    </w:p>
-    <w:p>
-      <w:pPr>
-        <w:spacing w:line="276" w:lineRule="auto"/>
-        <w:ind w:firstLine="440" w:firstLineChars="200"/>
-        <w:rPr>
-          <w:rFonts w:ascii="仿宋" w:hAnsi="仿宋" w:eastAsia="仿宋"/>
-          <w:sz w:val="22"/>
-        </w:rPr>
-      </w:pPr>
-      <w:r>
-        <w:rPr>
-          <w:rFonts w:hint="eastAsia" w:ascii="仿宋" w:hAnsi="仿宋" w:eastAsia="仿宋"/>
-          <w:sz w:val="22"/>
-        </w:rPr>
-        <w:t xml:space="preserve">（如：批复项目总预算 </w:t>
-      </w:r>
-      <w:r>
-        <w:rPr>
-          <w:rFonts w:ascii="仿宋" w:hAnsi="仿宋" w:eastAsia="仿宋"/>
-          <w:sz w:val="22"/>
-        </w:rPr>
-        <w:t xml:space="preserve"> </w:t>
-      </w:r>
-      <w:r>
-        <w:rPr>
-          <w:rFonts w:hint="eastAsia" w:ascii="仿宋" w:hAnsi="仿宋" w:eastAsia="仿宋"/>
-          <w:sz w:val="22"/>
-        </w:rPr>
-        <w:t>万元，其中集团公司资金 万元，单位自筹资金 万元，其他依托工程资金 万元，以签订的任务书数据为准）</w:t>
-      </w:r>
-    </w:p>
-    <w:p>
-      <w:pPr>
-        <w:spacing w:line="276" w:lineRule="auto"/>
-        <w:ind w:firstLine="440" w:firstLineChars="200"/>
-        <w:rPr>
-          <w:rFonts w:hint="eastAsia" w:ascii="仿宋" w:hAnsi="仿宋" w:eastAsia="仿宋"/>
-          <w:color w:val="C00000"/>
-          <w:sz w:val="22"/>
-          <w:lang w:val="en-US" w:eastAsia="zh-CN"/>
-        </w:rPr>
-      </w:pPr>
-      <w:r>
-        <w:rPr>
-          <w:rFonts w:hint="eastAsia" w:ascii="仿宋" w:hAnsi="仿宋" w:eastAsia="仿宋"/>
-          <w:color w:val="C00000"/>
-          <w:sz w:val="22"/>
-          <w:lang w:val="en-US" w:eastAsia="zh-CN"/>
-        </w:rPr>
-        <w:t>示例：</w:t>
-      </w:r>
-    </w:p>
-    <w:p>
-      <w:pPr>
-        <w:spacing w:line="276" w:lineRule="auto"/>
-        <w:ind w:firstLine="440" w:firstLineChars="200"/>
-        <w:rPr>
-          <w:rFonts w:hint="default" w:ascii="仿宋" w:hAnsi="仿宋" w:eastAsia="仿宋"/>
-          <w:color w:val="C00000"/>
-          <w:sz w:val="22"/>
-          <w:lang w:val="en-US" w:eastAsia="zh-CN"/>
-        </w:rPr>
-      </w:pPr>
-      <w:r>
-        <w:rPr>
-          <w:rFonts w:hint="eastAsia" w:ascii="仿宋" w:hAnsi="仿宋" w:eastAsia="仿宋"/>
-          <w:color w:val="C00000"/>
-          <w:sz w:val="22"/>
-          <w:lang w:val="en-US" w:eastAsia="zh-CN"/>
-        </w:rPr>
-        <w:t>根据</w:t>
-      </w:r>
-      <w:r>
-        <w:rPr>
-          <w:rFonts w:hint="eastAsia" w:ascii="仿宋" w:hAnsi="仿宋" w:eastAsia="仿宋"/>
-          <w:color w:val="C00000"/>
-          <w:sz w:val="22"/>
-        </w:rPr>
-        <w:t>项目任务书</w:t>
-      </w:r>
-      <w:r>
-        <w:rPr>
-          <w:rFonts w:hint="eastAsia" w:ascii="仿宋" w:hAnsi="仿宋" w:eastAsia="仿宋"/>
-          <w:color w:val="C00000"/>
-          <w:sz w:val="22"/>
-          <w:lang w:eastAsia="zh-CN"/>
-        </w:rPr>
-        <w:t>，</w:t>
-      </w:r>
-      <w:r>
-        <w:rPr>
-          <w:rFonts w:hint="eastAsia" w:ascii="仿宋" w:hAnsi="仿宋" w:eastAsia="仿宋"/>
-          <w:color w:val="C00000"/>
-          <w:sz w:val="22"/>
-          <w:lang w:val="en-US" w:eastAsia="zh-CN"/>
-        </w:rPr>
-        <w:t>本项目</w:t>
-      </w:r>
-      <w:r>
-        <w:rPr>
-          <w:rFonts w:hint="eastAsia" w:ascii="仿宋" w:hAnsi="仿宋" w:eastAsia="仿宋"/>
-          <w:color w:val="C00000"/>
-          <w:sz w:val="22"/>
-        </w:rPr>
-        <w:t>批复</w:t>
-      </w:r>
-      <w:r>
-        <w:rPr>
-          <w:rFonts w:hint="eastAsia" w:ascii="仿宋" w:hAnsi="仿宋" w:eastAsia="仿宋"/>
-          <w:color w:val="C00000"/>
-          <w:sz w:val="22"/>
-          <w:lang w:val="en-US" w:eastAsia="zh-CN"/>
-        </w:rPr>
-        <w:t>概</w:t>
-      </w:r>
-      <w:r>
-        <w:rPr>
-          <w:rFonts w:hint="eastAsia" w:ascii="仿宋" w:hAnsi="仿宋" w:eastAsia="仿宋"/>
-          <w:color w:val="C00000"/>
-          <w:sz w:val="22"/>
-        </w:rPr>
-        <w:t>预算</w:t>
-      </w:r>
-      <w:r>
-        <w:rPr>
-          <w:rFonts w:hint="eastAsia" w:ascii="仿宋" w:hAnsi="仿宋" w:eastAsia="仿宋"/>
-          <w:color w:val="C00000"/>
-          <w:sz w:val="22"/>
-          <w:lang w:val="en-US" w:eastAsia="zh-CN"/>
-        </w:rPr>
-        <w:t>总额XXX</w:t>
-      </w:r>
-      <w:r>
-        <w:rPr>
-          <w:rFonts w:hint="eastAsia" w:ascii="仿宋" w:hAnsi="仿宋" w:eastAsia="仿宋"/>
-          <w:color w:val="C00000"/>
-          <w:sz w:val="22"/>
-        </w:rPr>
-        <w:t>万元，其中</w:t>
-      </w:r>
-      <w:r>
-        <w:rPr>
-          <w:rFonts w:hint="eastAsia" w:ascii="仿宋" w:hAnsi="仿宋" w:eastAsia="仿宋"/>
-          <w:color w:val="C00000"/>
-          <w:sz w:val="22"/>
-          <w:highlight w:val="none"/>
-        </w:rPr>
-        <w:t>集团公司</w:t>
-      </w:r>
-      <w:r>
-        <w:rPr>
-          <w:rFonts w:hint="eastAsia" w:ascii="仿宋" w:hAnsi="仿宋" w:eastAsia="仿宋"/>
-          <w:color w:val="C00000"/>
-          <w:sz w:val="22"/>
-          <w:highlight w:val="none"/>
-          <w:lang w:val="en-US" w:eastAsia="zh-CN"/>
-        </w:rPr>
-        <w:t>/有限公司</w:t>
-      </w:r>
-      <w:r>
-        <w:rPr>
-          <w:rFonts w:hint="eastAsia" w:ascii="仿宋" w:hAnsi="仿宋" w:eastAsia="仿宋"/>
-          <w:color w:val="C00000"/>
-          <w:sz w:val="22"/>
-        </w:rPr>
-        <w:t>资金</w:t>
-      </w:r>
-      <w:r>
-        <w:rPr>
-          <w:rFonts w:hint="eastAsia" w:ascii="仿宋" w:hAnsi="仿宋" w:eastAsia="仿宋"/>
-          <w:color w:val="C00000"/>
-          <w:sz w:val="22"/>
-          <w:lang w:val="en-US" w:eastAsia="zh-CN"/>
-        </w:rPr>
-        <w:t>XXX</w:t>
-      </w:r>
-      <w:r>
-        <w:rPr>
-          <w:rFonts w:hint="eastAsia" w:ascii="仿宋" w:hAnsi="仿宋" w:eastAsia="仿宋"/>
-          <w:color w:val="C00000"/>
-          <w:sz w:val="22"/>
-        </w:rPr>
-        <w:t>万元，单位自筹资金</w:t>
-      </w:r>
-      <w:r>
-        <w:rPr>
-          <w:rFonts w:hint="eastAsia" w:ascii="仿宋" w:hAnsi="仿宋" w:eastAsia="仿宋"/>
-          <w:color w:val="C00000"/>
-          <w:sz w:val="22"/>
-          <w:lang w:val="en-US" w:eastAsia="zh-CN"/>
-        </w:rPr>
-        <w:t>XXX</w:t>
-      </w:r>
-      <w:r>
-        <w:rPr>
-          <w:rFonts w:hint="eastAsia" w:ascii="仿宋" w:hAnsi="仿宋" w:eastAsia="仿宋"/>
-          <w:color w:val="C00000"/>
-          <w:sz w:val="22"/>
-        </w:rPr>
-        <w:t>万元，其他依托工程资金</w:t>
-      </w:r>
-      <w:r>
-        <w:rPr>
-          <w:rFonts w:hint="eastAsia" w:ascii="仿宋" w:hAnsi="仿宋" w:eastAsia="仿宋"/>
-          <w:color w:val="C00000"/>
-          <w:sz w:val="22"/>
-          <w:lang w:val="en-US" w:eastAsia="zh-CN"/>
-        </w:rPr>
-        <w:t>XXX</w:t>
-      </w:r>
-      <w:r>
-        <w:rPr>
-          <w:rFonts w:hint="eastAsia" w:ascii="仿宋" w:hAnsi="仿宋" w:eastAsia="仿宋"/>
-          <w:color w:val="C00000"/>
-          <w:sz w:val="22"/>
-        </w:rPr>
-        <w:t>万元</w:t>
-      </w:r>
-      <w:r>
-        <w:rPr>
-          <w:rFonts w:hint="eastAsia" w:ascii="仿宋" w:hAnsi="仿宋" w:eastAsia="仿宋"/>
-          <w:color w:val="C00000"/>
-          <w:sz w:val="22"/>
-          <w:lang w:eastAsia="zh-CN"/>
-        </w:rPr>
-        <w:t>。</w:t>
-      </w:r>
-      <w:r>
-        <w:rPr>
-          <w:rFonts w:hint="eastAsia" w:ascii="仿宋" w:hAnsi="仿宋" w:eastAsia="仿宋"/>
-          <w:color w:val="C00000"/>
-          <w:sz w:val="22"/>
-          <w:lang w:val="en-US" w:eastAsia="zh-CN"/>
-        </w:rPr>
-        <w:t>批复概预算与任务合同书金额一致。</w:t>
-      </w:r>
-    </w:p>
-    <w:p>
-      <w:pPr>
-        <w:spacing w:line="276" w:lineRule="auto"/>
-        <w:ind w:firstLine="440" w:firstLineChars="200"/>
-        <w:rPr>
-          <w:rFonts w:hint="eastAsia" w:ascii="仿宋" w:hAnsi="仿宋" w:eastAsia="仿宋"/>
-          <w:sz w:val="22"/>
-        </w:rPr>
-      </w:pPr>
-    </w:p>
-    <w:p>
-      <w:pPr>
-        <w:spacing w:line="276" w:lineRule="auto"/>
-        <w:ind w:firstLine="420" w:firstLineChars="200"/>
-        <w:rPr>
-          <w:rFonts w:ascii="仿宋" w:hAnsi="仿宋" w:eastAsia="仿宋"/>
-          <w:color w:val="0070C0"/>
-        </w:rPr>
-      </w:pPr>
-    </w:p>
-    <w:p>
-      <w:pPr>
-        <w:numPr>
-          <w:ilvl w:val="0"/>
-          <w:numId w:val="3"/>
-        </w:numPr>
-        <w:spacing w:line="360" w:lineRule="auto"/>
-        <w:ind w:left="420" w:leftChars="200" w:firstLine="0" w:firstLineChars="0"/>
-        <w:rPr>
-          <w:rFonts w:hint="eastAsia" w:ascii="宋体" w:hAnsi="宋体"/>
-          <w:sz w:val="24"/>
-        </w:rPr>
-      </w:pPr>
-      <w:r>
-        <w:rPr>
-          <w:rFonts w:hint="eastAsia" w:ascii="宋体" w:hAnsi="宋体"/>
-          <w:sz w:val="24"/>
-        </w:rPr>
-        <w:t>概预算变更情况</w:t>
-      </w:r>
-    </w:p>
-    <w:p>
-      <w:pPr>
-        <w:spacing w:line="360" w:lineRule="auto"/>
-        <w:ind w:firstLine="440" w:firstLineChars="200"/>
-        <w:rPr>
-          <w:rFonts w:hint="eastAsia" w:ascii="仿宋" w:hAnsi="仿宋" w:eastAsia="仿宋"/>
-          <w:color w:val="auto"/>
-          <w:sz w:val="22"/>
-        </w:rPr>
-      </w:pPr>
-      <w:r>
-        <w:rPr>
-          <w:rFonts w:hint="eastAsia" w:ascii="仿宋" w:hAnsi="仿宋" w:eastAsia="仿宋"/>
-          <w:color w:val="auto"/>
-          <w:sz w:val="22"/>
-        </w:rPr>
-        <w:t>（简述批准的主要预算变更调整内容、调整理由和调整方式，变更调整后的概预算情况）</w:t>
-      </w:r>
-    </w:p>
-    <w:p>
-      <w:pPr>
-        <w:spacing w:line="360" w:lineRule="auto"/>
-        <w:ind w:firstLine="440" w:firstLineChars="200"/>
-        <w:rPr>
-          <w:rFonts w:hint="default" w:ascii="仿宋" w:hAnsi="仿宋" w:eastAsia="仿宋"/>
-          <w:color w:val="C00000"/>
-          <w:sz w:val="22"/>
-          <w:lang w:val="en-US" w:eastAsia="zh-CN"/>
-        </w:rPr>
-      </w:pPr>
-      <w:r>
-        <w:rPr>
-          <w:rFonts w:hint="eastAsia" w:ascii="仿宋" w:hAnsi="仿宋" w:eastAsia="仿宋"/>
-          <w:color w:val="C00000"/>
-          <w:sz w:val="22"/>
-          <w:lang w:val="en-US" w:eastAsia="zh-CN"/>
-        </w:rPr>
-        <w:t>注：概预算变更适用情形：</w:t>
-      </w:r>
-    </w:p>
-    <w:p>
-      <w:pPr>
-        <w:numPr>
-          <w:ilvl w:val="0"/>
-          <w:numId w:val="4"/>
-        </w:numPr>
-        <w:spacing w:line="360" w:lineRule="auto"/>
-        <w:ind w:firstLine="440" w:firstLineChars="200"/>
-        <w:rPr>
-          <w:rFonts w:hint="eastAsia" w:ascii="仿宋" w:hAnsi="仿宋" w:eastAsia="仿宋"/>
-          <w:color w:val="C00000"/>
-          <w:sz w:val="22"/>
-          <w:lang w:val="en-US" w:eastAsia="zh-CN"/>
-        </w:rPr>
-      </w:pPr>
-      <w:r>
-        <w:rPr>
-          <w:rFonts w:hint="eastAsia" w:ascii="仿宋" w:hAnsi="仿宋" w:eastAsia="仿宋"/>
-          <w:color w:val="C00000"/>
-          <w:sz w:val="22"/>
-          <w:lang w:val="en-US" w:eastAsia="zh-CN"/>
-        </w:rPr>
-        <w:t>重大变更事项</w:t>
-      </w:r>
-    </w:p>
-    <w:p>
-      <w:pPr>
-        <w:numPr>
-          <w:ilvl w:val="0"/>
-          <w:numId w:val="5"/>
-        </w:numPr>
-        <w:spacing w:line="360" w:lineRule="auto"/>
-        <w:ind w:left="5" w:leftChars="0" w:firstLine="415" w:firstLineChars="0"/>
-        <w:rPr>
-          <w:rFonts w:hint="default" w:ascii="仿宋" w:hAnsi="仿宋" w:eastAsia="仿宋"/>
-          <w:color w:val="C00000"/>
-          <w:sz w:val="22"/>
-          <w:lang w:val="en-US" w:eastAsia="zh-CN"/>
-        </w:rPr>
-      </w:pPr>
-      <w:r>
-        <w:rPr>
-          <w:rFonts w:hint="default" w:ascii="仿宋" w:hAnsi="仿宋" w:eastAsia="仿宋"/>
-          <w:color w:val="C00000"/>
-          <w:sz w:val="22"/>
-          <w:lang w:val="en-US" w:eastAsia="zh-CN"/>
-        </w:rPr>
-        <w:t>测试化验加工调增预算费用占本科目预算费用超 20%且额度超过 100 万元的</w:t>
-      </w:r>
-    </w:p>
-    <w:p>
-      <w:pPr>
-        <w:numPr>
-          <w:ilvl w:val="0"/>
-          <w:numId w:val="5"/>
-        </w:numPr>
-        <w:spacing w:line="360" w:lineRule="auto"/>
-        <w:ind w:left="5" w:leftChars="0" w:firstLine="415" w:firstLineChars="0"/>
-        <w:rPr>
-          <w:rFonts w:hint="default" w:ascii="仿宋" w:hAnsi="仿宋" w:eastAsia="仿宋"/>
-          <w:color w:val="C00000"/>
-          <w:sz w:val="22"/>
-          <w:lang w:val="en-US" w:eastAsia="zh-CN"/>
-        </w:rPr>
-      </w:pPr>
-      <w:r>
-        <w:rPr>
-          <w:rFonts w:hint="default" w:ascii="仿宋" w:hAnsi="仿宋" w:eastAsia="仿宋"/>
-          <w:color w:val="C00000"/>
-          <w:sz w:val="22"/>
-          <w:lang w:val="en-US" w:eastAsia="zh-CN"/>
-        </w:rPr>
-        <w:t>项目直接经费概算需要调增达50%以上的或者调增额2000万元以上，或者调增项目概算中集团资金预算的，或者调增项目概算中的设备与软件费或外委研究费科目预算的，或者从试验费科目调剂到其他科目的；</w:t>
-      </w:r>
-    </w:p>
-    <w:p>
-      <w:pPr>
-        <w:numPr>
-          <w:ilvl w:val="0"/>
-          <w:numId w:val="5"/>
-        </w:numPr>
-        <w:spacing w:line="360" w:lineRule="auto"/>
-        <w:ind w:left="5" w:leftChars="0" w:firstLine="415" w:firstLineChars="0"/>
-        <w:rPr>
-          <w:rFonts w:hint="default" w:ascii="仿宋" w:hAnsi="仿宋" w:eastAsia="仿宋"/>
-          <w:color w:val="C00000"/>
-          <w:sz w:val="22"/>
-          <w:lang w:val="en-US" w:eastAsia="zh-CN"/>
-        </w:rPr>
-      </w:pPr>
-      <w:r>
-        <w:rPr>
-          <w:rFonts w:hint="default" w:ascii="仿宋" w:hAnsi="仿宋" w:eastAsia="仿宋"/>
-          <w:color w:val="C00000"/>
-          <w:sz w:val="22"/>
-          <w:lang w:val="en-US" w:eastAsia="zh-CN"/>
-        </w:rPr>
-        <w:t>在项目年度预算批准下达后，需要调增其中集团资金年度预算的</w:t>
-      </w:r>
-    </w:p>
-    <w:p>
-      <w:pPr>
-        <w:numPr>
-          <w:ilvl w:val="0"/>
-          <w:numId w:val="4"/>
-        </w:numPr>
-        <w:spacing w:line="360" w:lineRule="auto"/>
-        <w:ind w:firstLine="440" w:firstLineChars="200"/>
-        <w:rPr>
-          <w:rFonts w:hint="eastAsia" w:ascii="仿宋" w:hAnsi="仿宋" w:eastAsia="仿宋"/>
-          <w:color w:val="C00000"/>
-          <w:sz w:val="22"/>
-          <w:lang w:val="en-US" w:eastAsia="zh-CN"/>
-        </w:rPr>
-      </w:pPr>
-      <w:r>
-        <w:rPr>
-          <w:rFonts w:hint="eastAsia" w:ascii="仿宋" w:hAnsi="仿宋" w:eastAsia="仿宋"/>
-          <w:color w:val="C00000"/>
-          <w:sz w:val="22"/>
-          <w:lang w:val="en-US" w:eastAsia="zh-CN"/>
-        </w:rPr>
-        <w:t>一般变更事项</w:t>
+        <w:t>科技项目（课题）经费概预算基本情况</w:t>
       </w:r>
     </w:p>
     <w:p>
@@ -3396,23 +2934,229 @@
           <w:numId w:val="6"/>
         </w:numPr>
         <w:spacing w:line="360" w:lineRule="auto"/>
-        <w:ind w:left="-5" w:leftChars="0" w:firstLine="425" w:firstLineChars="0"/>
+        <w:ind w:left="420" w:leftChars="200"/>
+        <w:rPr>
+          <w:rFonts w:hint="eastAsia" w:ascii="宋体" w:hAnsi="宋体"/>
+          <w:sz w:val="24"/>
+        </w:rPr>
+      </w:pPr>
+      <w:commentRangeStart w:id="5"/>
+      <w:r>
+        <w:rPr>
+          <w:rFonts w:hint="eastAsia" w:ascii="宋体" w:hAnsi="宋体"/>
+          <w:sz w:val="24"/>
+        </w:rPr>
+        <w:t>概预算批准情况</w:t>
+      </w:r>
+      <w:commentRangeEnd w:id="5"/>
+      <w:r>
+        <w:commentReference w:id="5"/>
+      </w:r>
+    </w:p>
+    <w:p>
+      <w:pPr>
+        <w:spacing w:line="276" w:lineRule="auto"/>
+        <w:ind w:firstLine="440" w:firstLineChars="200"/>
+        <w:rPr>
+          <w:rFonts w:hint="default" w:ascii="仿宋" w:hAnsi="仿宋" w:eastAsia="仿宋"/>
+          <w:color w:val="C00000"/>
+          <w:sz w:val="22"/>
+          <w:lang w:val="en-US" w:eastAsia="zh-CN"/>
+        </w:rPr>
+      </w:pPr>
+      <w:r>
         <w:rPr>
           <w:rFonts w:hint="eastAsia" w:ascii="仿宋" w:hAnsi="仿宋" w:eastAsia="仿宋"/>
           <w:color w:val="C00000"/>
           <w:sz w:val="22"/>
           <w:lang w:val="en-US" w:eastAsia="zh-CN"/>
         </w:rPr>
-      </w:pPr>
+        <w:t>根据</w:t>
+      </w:r>
       <w:r>
         <w:rPr>
           <w:rFonts w:hint="eastAsia" w:ascii="仿宋" w:hAnsi="仿宋" w:eastAsia="仿宋"/>
           <w:color w:val="C00000"/>
           <w:sz w:val="22"/>
+        </w:rPr>
+        <w:t>项目任务书</w:t>
+      </w:r>
+      <w:r>
+        <w:rPr>
+          <w:rFonts w:hint="eastAsia" w:ascii="仿宋" w:hAnsi="仿宋" w:eastAsia="仿宋"/>
+          <w:color w:val="C00000"/>
+          <w:sz w:val="22"/>
+          <w:lang w:eastAsia="zh-CN"/>
+        </w:rPr>
+        <w:t>，</w:t>
+      </w:r>
+      <w:r>
+        <w:rPr>
+          <w:rFonts w:hint="eastAsia" w:ascii="仿宋" w:hAnsi="仿宋" w:eastAsia="仿宋"/>
+          <w:color w:val="C00000"/>
+          <w:sz w:val="22"/>
           <w:lang w:val="en-US" w:eastAsia="zh-CN"/>
         </w:rPr>
-        <w:t>项目直接经费概算调增幅度在50%以下且调增额不超过2000万元，但不涉及集团资金预算调增的；</w:t>
-      </w:r>
+        <w:t>本项目</w:t>
+      </w:r>
+      <w:r>
+        <w:rPr>
+          <w:rFonts w:hint="eastAsia" w:ascii="仿宋" w:hAnsi="仿宋" w:eastAsia="仿宋"/>
+          <w:color w:val="C00000"/>
+          <w:sz w:val="22"/>
+        </w:rPr>
+        <w:t>批复</w:t>
+      </w:r>
+      <w:r>
+        <w:rPr>
+          <w:rFonts w:hint="eastAsia" w:ascii="仿宋" w:hAnsi="仿宋" w:eastAsia="仿宋"/>
+          <w:color w:val="C00000"/>
+          <w:sz w:val="22"/>
+          <w:lang w:val="en-US" w:eastAsia="zh-CN"/>
+        </w:rPr>
+        <w:t>概</w:t>
+      </w:r>
+      <w:r>
+        <w:rPr>
+          <w:rFonts w:hint="eastAsia" w:ascii="仿宋" w:hAnsi="仿宋" w:eastAsia="仿宋"/>
+          <w:color w:val="C00000"/>
+          <w:sz w:val="22"/>
+        </w:rPr>
+        <w:t>预算</w:t>
+      </w:r>
+      <w:r>
+        <w:rPr>
+          <w:rFonts w:hint="eastAsia" w:ascii="仿宋" w:hAnsi="仿宋" w:eastAsia="仿宋"/>
+          <w:color w:val="C00000"/>
+          <w:sz w:val="22"/>
+          <w:lang w:val="en-US" w:eastAsia="zh-CN"/>
+        </w:rPr>
+        <w:t>总额XXX</w:t>
+      </w:r>
+      <w:r>
+        <w:rPr>
+          <w:rFonts w:hint="eastAsia" w:ascii="仿宋" w:hAnsi="仿宋" w:eastAsia="仿宋"/>
+          <w:color w:val="C00000"/>
+          <w:sz w:val="22"/>
+        </w:rPr>
+        <w:t>万元，其中</w:t>
+      </w:r>
+      <w:r>
+        <w:rPr>
+          <w:rFonts w:hint="eastAsia" w:ascii="仿宋" w:hAnsi="仿宋" w:eastAsia="仿宋"/>
+          <w:color w:val="C00000"/>
+          <w:sz w:val="22"/>
+          <w:highlight w:val="none"/>
+        </w:rPr>
+        <w:t>集团公司</w:t>
+      </w:r>
+      <w:r>
+        <w:rPr>
+          <w:rFonts w:hint="eastAsia" w:ascii="仿宋" w:hAnsi="仿宋" w:eastAsia="仿宋"/>
+          <w:color w:val="C00000"/>
+          <w:sz w:val="22"/>
+          <w:highlight w:val="none"/>
+          <w:lang w:val="en-US" w:eastAsia="zh-CN"/>
+        </w:rPr>
+        <w:t>/有限公司</w:t>
+      </w:r>
+      <w:r>
+        <w:rPr>
+          <w:rFonts w:hint="eastAsia" w:ascii="仿宋" w:hAnsi="仿宋" w:eastAsia="仿宋"/>
+          <w:color w:val="C00000"/>
+          <w:sz w:val="22"/>
+        </w:rPr>
+        <w:t>资金</w:t>
+      </w:r>
+      <w:r>
+        <w:rPr>
+          <w:rFonts w:hint="eastAsia" w:ascii="仿宋" w:hAnsi="仿宋" w:eastAsia="仿宋"/>
+          <w:color w:val="C00000"/>
+          <w:sz w:val="22"/>
+          <w:lang w:val="en-US" w:eastAsia="zh-CN"/>
+        </w:rPr>
+        <w:t>XXX</w:t>
+      </w:r>
+      <w:r>
+        <w:rPr>
+          <w:rFonts w:hint="eastAsia" w:ascii="仿宋" w:hAnsi="仿宋" w:eastAsia="仿宋"/>
+          <w:color w:val="C00000"/>
+          <w:sz w:val="22"/>
+        </w:rPr>
+        <w:t>万元，单位自筹资金</w:t>
+      </w:r>
+      <w:r>
+        <w:rPr>
+          <w:rFonts w:hint="eastAsia" w:ascii="仿宋" w:hAnsi="仿宋" w:eastAsia="仿宋"/>
+          <w:color w:val="C00000"/>
+          <w:sz w:val="22"/>
+          <w:lang w:val="en-US" w:eastAsia="zh-CN"/>
+        </w:rPr>
+        <w:t>XXX</w:t>
+      </w:r>
+      <w:r>
+        <w:rPr>
+          <w:rFonts w:hint="eastAsia" w:ascii="仿宋" w:hAnsi="仿宋" w:eastAsia="仿宋"/>
+          <w:color w:val="C00000"/>
+          <w:sz w:val="22"/>
+        </w:rPr>
+        <w:t>万元，其他依托工程资金</w:t>
+      </w:r>
+      <w:r>
+        <w:rPr>
+          <w:rFonts w:hint="eastAsia" w:ascii="仿宋" w:hAnsi="仿宋" w:eastAsia="仿宋"/>
+          <w:color w:val="C00000"/>
+          <w:sz w:val="22"/>
+          <w:lang w:val="en-US" w:eastAsia="zh-CN"/>
+        </w:rPr>
+        <w:t>XXX</w:t>
+      </w:r>
+      <w:r>
+        <w:rPr>
+          <w:rFonts w:hint="eastAsia" w:ascii="仿宋" w:hAnsi="仿宋" w:eastAsia="仿宋"/>
+          <w:color w:val="C00000"/>
+          <w:sz w:val="22"/>
+        </w:rPr>
+        <w:t>万元</w:t>
+      </w:r>
+      <w:r>
+        <w:rPr>
+          <w:rFonts w:hint="eastAsia" w:ascii="仿宋" w:hAnsi="仿宋" w:eastAsia="仿宋"/>
+          <w:color w:val="C00000"/>
+          <w:sz w:val="22"/>
+          <w:lang w:eastAsia="zh-CN"/>
+        </w:rPr>
+        <w:t>。</w:t>
+      </w:r>
+      <w:r>
+        <w:rPr>
+          <w:rFonts w:hint="eastAsia" w:ascii="仿宋" w:hAnsi="仿宋" w:eastAsia="仿宋"/>
+          <w:color w:val="C00000"/>
+          <w:sz w:val="22"/>
+          <w:lang w:val="en-US" w:eastAsia="zh-CN"/>
+        </w:rPr>
+        <w:t>批复概预算与任务合同书金额一致。</w:t>
+      </w:r>
+    </w:p>
+    <w:p>
+      <w:pPr>
+        <w:spacing w:line="276" w:lineRule="auto"/>
+        <w:ind w:firstLine="440" w:firstLineChars="200"/>
+        <w:rPr>
+          <w:rFonts w:hint="eastAsia" w:ascii="仿宋" w:hAnsi="仿宋" w:eastAsia="仿宋"/>
+          <w:sz w:val="22"/>
+        </w:rPr>
+      </w:pPr>
+    </w:p>
+    <w:p>
+      <w:pPr>
+        <w:spacing w:line="276" w:lineRule="auto"/>
+        <w:ind w:firstLine="420" w:firstLineChars="200"/>
+        <w:rPr>
+          <w:rFonts w:ascii="仿宋" w:hAnsi="仿宋" w:eastAsia="仿宋"/>
+          <w:color w:val="0070C0"/>
+        </w:rPr>
+      </w:pPr>
     </w:p>
     <w:p>
       <w:pPr>
@@ -3421,53 +3165,23 @@
           <w:numId w:val="6"/>
         </w:numPr>
         <w:spacing w:line="360" w:lineRule="auto"/>
-        <w:ind w:left="-5" w:leftChars="0" w:firstLine="425" w:firstLineChars="0"/>
-        <w:rPr>
-          <w:rFonts w:hint="eastAsia" w:ascii="仿宋" w:hAnsi="仿宋" w:eastAsia="仿宋"/>
-          <w:color w:val="C00000"/>
-          <w:sz w:val="22"/>
-          <w:lang w:val="en-US" w:eastAsia="zh-CN"/>
-        </w:rPr>
-      </w:pPr>
-      <w:r>
-        <w:rPr>
-          <w:rFonts w:hint="eastAsia" w:ascii="仿宋" w:hAnsi="仿宋" w:eastAsia="仿宋"/>
-          <w:color w:val="C00000"/>
-          <w:sz w:val="22"/>
-          <w:lang w:val="en-US" w:eastAsia="zh-CN"/>
-        </w:rPr>
-        <w:t>在项目直接经费概算不变情况下，除重大变更中涉及设备与软件费及外委研究费科目的预算调增、测试化验加工预算调增以及试验费向其他科目的调剂情形以外，其他有关各科目之间的预算调剂；</w:t>
-      </w:r>
-    </w:p>
-    <w:p>
-      <w:pPr>
-        <w:spacing w:line="360" w:lineRule="auto"/>
-        <w:ind w:firstLine="440" w:firstLineChars="200"/>
-        <w:rPr>
-          <w:rFonts w:hint="eastAsia" w:ascii="仿宋" w:hAnsi="仿宋" w:eastAsia="仿宋"/>
-          <w:sz w:val="22"/>
-        </w:rPr>
-      </w:pPr>
-    </w:p>
-    <w:p>
-      <w:pPr>
-        <w:spacing w:line="360" w:lineRule="auto"/>
-        <w:ind w:firstLine="440" w:firstLineChars="200"/>
-        <w:rPr>
-          <w:rFonts w:hint="default" w:ascii="仿宋" w:hAnsi="仿宋" w:eastAsia="仿宋"/>
-          <w:color w:val="C00000"/>
-          <w:sz w:val="22"/>
-          <w:lang w:val="en-US" w:eastAsia="zh-CN"/>
-        </w:rPr>
-      </w:pPr>
-      <w:r>
-        <w:rPr>
-          <w:rFonts w:hint="eastAsia" w:ascii="仿宋" w:hAnsi="仿宋" w:eastAsia="仿宋"/>
-          <w:color w:val="C00000"/>
-          <w:sz w:val="22"/>
-          <w:lang w:val="en-US" w:eastAsia="zh-CN"/>
-        </w:rPr>
-        <w:t>示例：</w:t>
+        <w:ind w:left="420" w:leftChars="200" w:firstLine="0" w:firstLineChars="0"/>
+        <w:rPr>
+          <w:rFonts w:hint="eastAsia" w:ascii="宋体" w:hAnsi="宋体"/>
+          <w:sz w:val="24"/>
+        </w:rPr>
+      </w:pPr>
+      <w:commentRangeStart w:id="6"/>
+      <w:r>
+        <w:rPr>
+          <w:rFonts w:hint="eastAsia" w:ascii="宋体" w:hAnsi="宋体"/>
+          <w:sz w:val="24"/>
+        </w:rPr>
+        <w:t>概预算变更情况</w:t>
+      </w:r>
+      <w:commentRangeEnd w:id="6"/>
+      <w:r>
+        <w:commentReference w:id="6"/>
       </w:r>
     </w:p>
     <w:p>
@@ -5391,7 +5105,7 @@
       <w:pPr>
         <w:numPr>
           <w:ilvl w:val="0"/>
-          <w:numId w:val="2"/>
+          <w:numId w:val="5"/>
         </w:numPr>
         <w:tabs>
           <w:tab w:val="left" w:pos="630"/>
@@ -5419,7 +5133,7 @@
       <w:pPr>
         <w:numPr>
           <w:ilvl w:val="1"/>
-          <w:numId w:val="2"/>
+          <w:numId w:val="5"/>
         </w:numPr>
         <w:tabs>
           <w:tab w:val="left" w:pos="709"/>
@@ -5447,20 +5161,40 @@
     </w:p>
     <w:p>
       <w:pPr>
-        <w:spacing w:line="276" w:lineRule="auto"/>
+        <w:spacing w:before="120" w:beforeLines="50" w:line="276" w:lineRule="auto"/>
         <w:ind w:firstLine="440" w:firstLineChars="200"/>
         <w:rPr>
-          <w:rFonts w:ascii="Calibri" w:hAnsi="Calibri"/>
-          <w:sz w:val="22"/>
-          <w:szCs w:val="22"/>
+          <w:rFonts w:hint="default" w:ascii="仿宋" w:hAnsi="仿宋" w:eastAsia="仿宋"/>
+          <w:color w:val="C00000"/>
+          <w:sz w:val="22"/>
+          <w:lang w:val="en-US" w:eastAsia="zh-CN"/>
         </w:rPr>
       </w:pPr>
       <w:r>
         <w:rPr>
           <w:rFonts w:hint="eastAsia" w:ascii="仿宋" w:hAnsi="仿宋" w:eastAsia="仿宋"/>
-          <w:sz w:val="22"/>
-        </w:rPr>
-        <w:t>（说明项目总概算是否都已分年得到批复，集团公司资金是否都已拨付；依托工程生产配套资金是否批复）</w:t>
+          <w:color w:val="C00000"/>
+          <w:sz w:val="22"/>
+          <w:lang w:val="en-US" w:eastAsia="zh-CN"/>
+        </w:rPr>
+        <w:t>集团公司/</w:t>
+      </w:r>
+      <w:r>
+        <w:rPr>
+          <w:rFonts w:hint="eastAsia" w:ascii="仿宋" w:hAnsi="仿宋" w:eastAsia="仿宋"/>
+          <w:color w:val="C00000"/>
+          <w:sz w:val="22"/>
+        </w:rPr>
+        <w:t>有限公司</w:t>
+      </w:r>
+      <w:r>
+        <w:rPr>
+          <w:rFonts w:hint="eastAsia" w:ascii="仿宋" w:hAnsi="仿宋" w:eastAsia="仿宋"/>
+          <w:color w:val="C00000"/>
+          <w:sz w:val="22"/>
+          <w:lang w:val="en-US" w:eastAsia="zh-CN"/>
+        </w:rPr>
+        <w:t>分年实际下达预算总额XXX万元，与任务合同书概预算一致或较任务合同书概预算减少XXX万元。其中：20XX年下达XXX万元、20XX年下达XXX万元、20XX年下达XXX万元。</w:t>
       </w:r>
     </w:p>
     <w:p>
@@ -5472,108 +5206,32 @@
           <w:sz w:val="22"/>
         </w:rPr>
       </w:pPr>
-      <w:r>
-        <w:rPr>
-          <w:rFonts w:hint="eastAsia" w:ascii="仿宋" w:hAnsi="仿宋" w:eastAsia="仿宋"/>
-          <w:sz w:val="22"/>
-        </w:rPr>
-        <w:t>（如有未完全批复及拨付的，请详细说明原因）</w:t>
-      </w:r>
     </w:p>
     <w:p>
       <w:pPr>
-        <w:spacing w:before="120" w:beforeLines="50" w:line="276" w:lineRule="auto"/>
-        <w:ind w:firstLine="440" w:firstLineChars="200"/>
-        <w:rPr>
-          <w:rFonts w:hint="eastAsia" w:ascii="仿宋" w:hAnsi="仿宋" w:eastAsia="仿宋"/>
-          <w:color w:val="C00000"/>
-          <w:sz w:val="22"/>
-          <w:lang w:val="en-US" w:eastAsia="zh-CN"/>
-        </w:rPr>
-      </w:pPr>
-      <w:r>
-        <w:rPr>
-          <w:rFonts w:hint="eastAsia" w:ascii="仿宋" w:hAnsi="仿宋" w:eastAsia="仿宋"/>
-          <w:color w:val="C00000"/>
-          <w:sz w:val="22"/>
-          <w:lang w:val="en-US" w:eastAsia="zh-CN"/>
-        </w:rPr>
-        <w:t>示例：</w:t>
-      </w:r>
+        <w:spacing w:line="276" w:lineRule="auto"/>
+        <w:ind w:firstLine="420" w:firstLineChars="200"/>
+        <w:rPr>
+          <w:rFonts w:ascii="仿宋" w:hAnsi="仿宋" w:eastAsia="仿宋"/>
+          <w:color w:val="0070C0"/>
+        </w:rPr>
+      </w:pPr>
     </w:p>
     <w:p>
       <w:pPr>
-        <w:spacing w:before="120" w:beforeLines="50" w:line="276" w:lineRule="auto"/>
-        <w:ind w:firstLine="440" w:firstLineChars="200"/>
-        <w:rPr>
-          <w:rFonts w:hint="default" w:ascii="仿宋" w:hAnsi="仿宋" w:eastAsia="仿宋"/>
-          <w:color w:val="C00000"/>
-          <w:sz w:val="22"/>
-          <w:lang w:val="en-US" w:eastAsia="zh-CN"/>
-        </w:rPr>
-      </w:pPr>
-      <w:r>
-        <w:rPr>
-          <w:rFonts w:hint="eastAsia" w:ascii="仿宋" w:hAnsi="仿宋" w:eastAsia="仿宋"/>
-          <w:color w:val="C00000"/>
-          <w:sz w:val="22"/>
-          <w:lang w:val="en-US" w:eastAsia="zh-CN"/>
-        </w:rPr>
-        <w:t>集团公司/</w:t>
-      </w:r>
-      <w:r>
-        <w:rPr>
-          <w:rFonts w:hint="eastAsia" w:ascii="仿宋" w:hAnsi="仿宋" w:eastAsia="仿宋"/>
-          <w:color w:val="C00000"/>
-          <w:sz w:val="22"/>
-        </w:rPr>
-        <w:t>有限公司</w:t>
-      </w:r>
-      <w:r>
-        <w:rPr>
-          <w:rFonts w:hint="eastAsia" w:ascii="仿宋" w:hAnsi="仿宋" w:eastAsia="仿宋"/>
-          <w:color w:val="C00000"/>
-          <w:sz w:val="22"/>
-          <w:lang w:val="en-US" w:eastAsia="zh-CN"/>
-        </w:rPr>
-        <w:t>分年实际下达预算总额XXX万元，与任务合同书概预算一致或较任务合同书概预算减少XXX万元。其中：20XX年下达XXX万元、20XX年下达XXX万元、20XX年下达XXX万元。</w:t>
-      </w:r>
+        <w:spacing w:line="276" w:lineRule="auto"/>
+        <w:ind w:firstLine="420" w:firstLineChars="200"/>
+        <w:rPr>
+          <w:rFonts w:ascii="仿宋" w:hAnsi="仿宋" w:eastAsia="仿宋"/>
+          <w:color w:val="0070C0"/>
+        </w:rPr>
+      </w:pPr>
     </w:p>
     <w:p>
       <w:pPr>
-        <w:spacing w:before="120" w:beforeLines="50" w:line="276" w:lineRule="auto"/>
-        <w:ind w:firstLine="440" w:firstLineChars="200"/>
-        <w:rPr>
-          <w:rFonts w:hint="eastAsia" w:ascii="仿宋" w:hAnsi="仿宋" w:eastAsia="仿宋"/>
-          <w:sz w:val="22"/>
-        </w:rPr>
-      </w:pPr>
-    </w:p>
-    <w:p>
-      <w:pPr>
-        <w:spacing w:line="276" w:lineRule="auto"/>
-        <w:ind w:firstLine="420" w:firstLineChars="200"/>
-        <w:rPr>
-          <w:rFonts w:ascii="仿宋" w:hAnsi="仿宋" w:eastAsia="仿宋"/>
-          <w:color w:val="0070C0"/>
-        </w:rPr>
-      </w:pPr>
-    </w:p>
-    <w:p>
-      <w:pPr>
-        <w:spacing w:line="276" w:lineRule="auto"/>
-        <w:ind w:firstLine="420" w:firstLineChars="200"/>
-        <w:rPr>
-          <w:rFonts w:ascii="仿宋" w:hAnsi="仿宋" w:eastAsia="仿宋"/>
-          <w:color w:val="0070C0"/>
-        </w:rPr>
-      </w:pPr>
-    </w:p>
-    <w:p>
-      <w:pPr>
         <w:numPr>
           <w:ilvl w:val="1"/>
-          <w:numId w:val="2"/>
+          <w:numId w:val="5"/>
         </w:numPr>
         <w:tabs>
           <w:tab w:val="left" w:pos="851"/>
@@ -5601,89 +5259,6 @@
     </w:p>
     <w:p>
       <w:pPr>
-        <w:spacing w:line="360" w:lineRule="auto"/>
-        <w:ind w:left="420" w:leftChars="200"/>
-        <w:rPr>
-          <w:rFonts w:ascii="宋体" w:hAnsi="宋体"/>
-          <w:sz w:val="24"/>
-        </w:rPr>
-      </w:pPr>
-      <w:r>
-        <w:rPr>
-          <w:rFonts w:hint="eastAsia" w:ascii="宋体" w:hAnsi="宋体"/>
-          <w:sz w:val="24"/>
-        </w:rPr>
-        <w:t>1</w:t>
-      </w:r>
-      <w:r>
-        <w:rPr>
-          <w:rFonts w:ascii="宋体" w:hAnsi="宋体"/>
-          <w:sz w:val="24"/>
-        </w:rPr>
-        <w:t xml:space="preserve">. </w:t>
-      </w:r>
-      <w:r>
-        <w:rPr>
-          <w:rFonts w:hint="eastAsia" w:ascii="宋体" w:hAnsi="宋体"/>
-          <w:sz w:val="24"/>
-        </w:rPr>
-        <w:t>支出(预</w:t>
-      </w:r>
-      <w:r>
-        <w:rPr>
-          <w:rFonts w:ascii="宋体" w:hAnsi="宋体"/>
-          <w:sz w:val="24"/>
-        </w:rPr>
-        <w:t>)</w:t>
-      </w:r>
-      <w:r>
-        <w:rPr>
-          <w:rFonts w:hint="eastAsia" w:ascii="宋体" w:hAnsi="宋体"/>
-          <w:sz w:val="24"/>
-        </w:rPr>
-        <w:t>决算总体情况</w:t>
-      </w:r>
-    </w:p>
-    <w:p>
-      <w:pPr>
-        <w:spacing w:line="276" w:lineRule="auto"/>
-        <w:ind w:firstLine="440" w:firstLineChars="200"/>
-        <w:rPr>
-          <w:rFonts w:ascii="仿宋" w:hAnsi="仿宋" w:eastAsia="仿宋"/>
-          <w:sz w:val="22"/>
-        </w:rPr>
-      </w:pPr>
-      <w:r>
-        <w:rPr>
-          <w:rFonts w:hint="eastAsia" w:ascii="仿宋" w:hAnsi="仿宋" w:eastAsia="仿宋"/>
-          <w:sz w:val="22"/>
-        </w:rPr>
-        <w:t>（包括项目（课题）直接经费、依托工程经费总体实际支出情况；项目直接经费中各类来源资金的支出情况）</w:t>
-      </w:r>
-    </w:p>
-    <w:p>
-      <w:pPr>
-        <w:spacing w:before="120" w:beforeLines="50" w:line="276" w:lineRule="auto"/>
-        <w:ind w:firstLine="440" w:firstLineChars="200"/>
-        <w:rPr>
-          <w:rFonts w:hint="eastAsia" w:ascii="仿宋" w:hAnsi="仿宋" w:eastAsia="仿宋"/>
-          <w:color w:val="C00000"/>
-          <w:sz w:val="22"/>
-          <w:lang w:val="en-US" w:eastAsia="zh-CN"/>
-        </w:rPr>
-      </w:pPr>
-      <w:r>
-        <w:rPr>
-          <w:rFonts w:hint="eastAsia" w:ascii="仿宋" w:hAnsi="仿宋" w:eastAsia="仿宋"/>
-          <w:color w:val="C00000"/>
-          <w:sz w:val="22"/>
-          <w:lang w:val="en-US" w:eastAsia="zh-CN"/>
-        </w:rPr>
-        <w:t>示例：</w:t>
-      </w:r>
-    </w:p>
-    <w:p>
-      <w:pPr>
         <w:spacing w:before="120" w:beforeLines="50" w:line="276" w:lineRule="auto"/>
         <w:ind w:firstLine="440" w:firstLineChars="200"/>
         <w:rPr>
@@ -5757,78 +5332,6 @@
     </w:p>
     <w:p>
       <w:pPr>
-        <w:spacing w:before="72" w:beforeLines="30" w:line="276" w:lineRule="auto"/>
-        <w:ind w:firstLine="440" w:firstLineChars="200"/>
-        <w:rPr>
-          <w:rFonts w:ascii="仿宋" w:hAnsi="仿宋" w:eastAsia="仿宋"/>
-          <w:sz w:val="22"/>
-        </w:rPr>
-      </w:pPr>
-      <w:r>
-        <w:rPr>
-          <w:rFonts w:hint="eastAsia" w:ascii="仿宋" w:hAnsi="仿宋" w:eastAsia="仿宋"/>
-          <w:sz w:val="22"/>
-        </w:rPr>
-        <w:t>（按科目分析主要支出项占比情况、外委外协支出总额及其系统外单位支出额、其他需要特别说明的事项，不需要列表）</w:t>
-      </w:r>
-    </w:p>
-    <w:p>
-      <w:pPr>
-        <w:spacing w:before="72" w:beforeLines="30" w:line="276" w:lineRule="auto"/>
-        <w:ind w:firstLine="440" w:firstLineChars="200"/>
-        <w:rPr>
-          <w:rFonts w:ascii="仿宋" w:hAnsi="仿宋" w:eastAsia="仿宋"/>
-          <w:sz w:val="22"/>
-        </w:rPr>
-      </w:pPr>
-      <w:r>
-        <w:rPr>
-          <w:rFonts w:hint="eastAsia" w:ascii="仿宋" w:hAnsi="仿宋" w:eastAsia="仿宋"/>
-          <w:sz w:val="22"/>
-        </w:rPr>
-        <w:t>（外委比例情况：外委研究费占直接经费总支出的比例，其中委托系统外单位的外委研究费占直接经费总支出比例情况）</w:t>
-      </w:r>
-    </w:p>
-    <w:p>
-      <w:pPr>
-        <w:spacing w:before="72" w:beforeLines="30" w:line="276" w:lineRule="auto"/>
-        <w:ind w:firstLine="440" w:firstLineChars="200"/>
-        <w:rPr>
-          <w:rFonts w:ascii="仿宋" w:hAnsi="仿宋" w:eastAsia="仿宋"/>
-          <w:sz w:val="22"/>
-        </w:rPr>
-      </w:pPr>
-      <w:r>
-        <w:rPr>
-          <w:rFonts w:hint="eastAsia" w:ascii="仿宋" w:hAnsi="仿宋" w:eastAsia="仿宋"/>
-          <w:sz w:val="22"/>
-        </w:rPr>
-        <w:t>（针对集团公司科技项目（课题），分析集团公司资金支出在科研直接经费支出中所占比例，是否符合规定比例范围）</w:t>
-      </w:r>
-    </w:p>
-    <w:p>
-      <w:pPr>
-        <w:spacing w:before="120" w:beforeLines="50" w:line="276" w:lineRule="auto"/>
-        <w:ind w:firstLine="440" w:firstLineChars="200"/>
-        <w:rPr>
-          <w:rFonts w:hint="default" w:ascii="仿宋" w:hAnsi="仿宋" w:eastAsia="仿宋"/>
-          <w:color w:val="C00000"/>
-          <w:sz w:val="22"/>
-          <w:lang w:val="en-US" w:eastAsia="zh-CN"/>
-        </w:rPr>
-      </w:pPr>
-      <w:r>
-        <w:rPr>
-          <w:rFonts w:hint="eastAsia" w:ascii="仿宋" w:hAnsi="仿宋" w:eastAsia="仿宋"/>
-          <w:color w:val="C00000"/>
-          <w:sz w:val="22"/>
-          <w:lang w:val="en-US" w:eastAsia="zh-CN"/>
-        </w:rPr>
-        <w:t>示例：</w:t>
-      </w:r>
-    </w:p>
-    <w:p>
-      <w:pPr>
         <w:numPr>
           <w:ilvl w:val="0"/>
           <w:numId w:val="8"/>
@@ -6919,7 +6422,7 @@
       <w:pPr>
         <w:numPr>
           <w:ilvl w:val="1"/>
-          <w:numId w:val="2"/>
+          <w:numId w:val="5"/>
         </w:numPr>
         <w:tabs>
           <w:tab w:val="left" w:pos="851"/>
@@ -6947,44 +6450,6 @@
     </w:p>
     <w:p>
       <w:pPr>
-        <w:spacing w:line="360" w:lineRule="auto"/>
-        <w:ind w:firstLine="440" w:firstLineChars="200"/>
-        <w:rPr>
-          <w:rFonts w:hint="eastAsia" w:ascii="仿宋" w:hAnsi="仿宋" w:eastAsia="仿宋"/>
-          <w:sz w:val="22"/>
-        </w:rPr>
-      </w:pPr>
-      <w:r>
-        <w:rPr>
-          <w:rFonts w:hint="eastAsia" w:ascii="仿宋" w:hAnsi="仿宋" w:eastAsia="仿宋"/>
-          <w:sz w:val="22"/>
-        </w:rPr>
-        <w:t>（与科技项目概预算批准额相比，结余额达10%以上的要说明结余主要原因）</w:t>
-      </w:r>
-    </w:p>
-    <w:p>
-      <w:pPr>
-        <w:spacing w:before="120" w:beforeLines="50" w:line="276" w:lineRule="auto"/>
-        <w:ind w:firstLine="440" w:firstLineChars="200"/>
-        <w:rPr>
-          <w:rFonts w:hint="default" w:ascii="仿宋" w:hAnsi="仿宋" w:eastAsia="仿宋"/>
-          <w:color w:val="C00000"/>
-          <w:sz w:val="22"/>
-          <w:lang w:val="en-US" w:eastAsia="zh-CN"/>
-        </w:rPr>
-      </w:pPr>
-      <w:r>
-        <w:rPr>
-          <w:rFonts w:hint="eastAsia" w:ascii="仿宋" w:hAnsi="仿宋" w:eastAsia="仿宋"/>
-          <w:color w:val="C00000"/>
-          <w:sz w:val="22"/>
-          <w:lang w:val="en-US" w:eastAsia="zh-CN"/>
-        </w:rPr>
-        <w:t>示例：</w:t>
-      </w:r>
-    </w:p>
-    <w:p>
-      <w:pPr>
         <w:numPr>
           <w:ilvl w:val="0"/>
           <w:numId w:val="0"/>
@@ -7694,7 +7159,7 @@
       <w:pPr>
         <w:numPr>
           <w:ilvl w:val="0"/>
-          <w:numId w:val="2"/>
+          <w:numId w:val="5"/>
         </w:numPr>
         <w:tabs>
           <w:tab w:val="left" w:pos="630"/>
@@ -7708,6 +7173,7 @@
           <w:szCs w:val="28"/>
         </w:rPr>
       </w:pPr>
+      <w:commentRangeStart w:id="7"/>
       <w:r>
         <w:rPr>
           <w:rFonts w:hint="eastAsia" w:ascii="宋体" w:hAnsi="宋体"/>
@@ -7717,6 +7183,10 @@
         </w:rPr>
         <w:t>经费管理和使用过程中的问题及建议</w:t>
       </w:r>
+      <w:commentRangeEnd w:id="7"/>
+      <w:r>
+        <w:commentReference w:id="7"/>
+      </w:r>
     </w:p>
     <w:p>
       <w:pPr>
@@ -7751,19 +7221,89 @@
     </w:p>
     <w:p>
       <w:pPr>
+        <w:spacing w:before="120" w:beforeLines="50" w:line="276" w:lineRule="auto"/>
+        <w:ind w:firstLine="440" w:firstLineChars="200"/>
+        <w:rPr>
+          <w:rFonts w:hint="default" w:ascii="仿宋" w:hAnsi="仿宋" w:eastAsia="仿宋"/>
+          <w:color w:val="C00000"/>
+          <w:sz w:val="22"/>
+          <w:lang w:val="en-US" w:eastAsia="zh-CN"/>
+        </w:rPr>
+      </w:pPr>
+      <w:r>
+        <w:rPr>
+          <w:rFonts w:hint="eastAsia" w:ascii="仿宋" w:hAnsi="仿宋" w:eastAsia="仿宋"/>
+          <w:color w:val="C00000"/>
+          <w:sz w:val="22"/>
+          <w:lang w:val="en-US" w:eastAsia="zh-CN"/>
+        </w:rPr>
+        <w:t>中海油研究总院有限责任公司/中海石油（中国）有限公司北京研究中心执行《企业会计准则》。依据集团公司、有限公司财务管理制度以及本单位实际情况，制定了涵盖预算管理、资金管理、费用报销、财务档案管理等制度，主要包括《中海油研究总院有限责任公司/中海石油（中国）有限公司北京研究中心财务管理制度》、《中海油研究总院有限责任公司/中海石油（中国）有限公司北京研究中心全面预算管理办法》、《中海油研究总院有限责任公司/中海石油（中国）有限公司北京研究中心科研项目财务管理办法》、《中海油研究总院有限责任公司/中海石油（中国）有限公司北京研究中心资金管理办法》、《中海油研究总院有限责任公司/中海石油（中国）有限公司北京研究中心会计核算办法》</w:t>
+      </w:r>
+      <w:bookmarkStart w:id="0" w:name="_GoBack"/>
+      <w:bookmarkEnd w:id="0"/>
+      <w:r>
+        <w:rPr>
+          <w:rFonts w:hint="eastAsia" w:ascii="仿宋" w:hAnsi="仿宋" w:eastAsia="仿宋"/>
+          <w:color w:val="C00000"/>
+          <w:sz w:val="22"/>
+          <w:lang w:val="en-US" w:eastAsia="zh-CN"/>
+        </w:rPr>
+        <w:t>、《中海油研究总院有限责任公司/中海石油（中国）有限公司北京研究中心经费报销管理细则》、《中海油研究总院有限责任公司/中海石油（中国）有限公司北京研究中心境内差旅费管理细则》、《中海油研究总院有限责任公司/中海石油（中国）有限公司北京研究中心资金管理细则》、《中海油研究总院有限责任公司/中海石油（中国）有限公司北京研究中心会计档案管理细则》等。</w:t>
+      </w:r>
+    </w:p>
+    <w:p>
+      <w:pPr>
+        <w:spacing w:before="120" w:beforeLines="50" w:line="276" w:lineRule="auto"/>
+        <w:ind w:firstLine="440" w:firstLineChars="200"/>
+        <w:rPr>
+          <w:rFonts w:hint="eastAsia" w:ascii="仿宋" w:hAnsi="仿宋" w:eastAsia="仿宋"/>
+          <w:color w:val="C00000"/>
+          <w:sz w:val="22"/>
+          <w:lang w:val="en-US" w:eastAsia="zh-CN"/>
+        </w:rPr>
+      </w:pPr>
+    </w:p>
+    <w:p>
+      <w:pPr>
+        <w:spacing w:before="120" w:beforeLines="50" w:line="276" w:lineRule="auto"/>
+        <w:ind w:firstLine="440" w:firstLineChars="200"/>
+        <w:rPr>
+          <w:rFonts w:hint="default" w:ascii="仿宋" w:hAnsi="仿宋" w:eastAsia="仿宋"/>
+          <w:color w:val="C00000"/>
+          <w:sz w:val="22"/>
+          <w:lang w:val="en-US" w:eastAsia="zh-CN"/>
+        </w:rPr>
+      </w:pPr>
+    </w:p>
+    <w:p>
+      <w:pPr>
         <w:spacing w:line="360" w:lineRule="auto"/>
         <w:ind w:left="420" w:leftChars="200"/>
         <w:rPr>
-          <w:rFonts w:ascii="仿宋" w:hAnsi="仿宋" w:eastAsia="仿宋"/>
-          <w:sz w:val="22"/>
-        </w:rPr>
-      </w:pPr>
-      <w:r>
-        <w:rPr>
-          <w:rFonts w:hint="eastAsia" w:ascii="仿宋" w:hAnsi="仿宋" w:eastAsia="仿宋"/>
-          <w:sz w:val="22"/>
-        </w:rPr>
-        <w:t>（包括依据的集团公司及本企业科研经费管理有关制度情况）</w:t>
+          <w:rFonts w:ascii="宋体" w:hAnsi="宋体"/>
+          <w:sz w:val="24"/>
+        </w:rPr>
+      </w:pPr>
+      <w:r>
+        <w:rPr>
+          <w:rFonts w:hint="eastAsia" w:ascii="宋体" w:hAnsi="宋体"/>
+          <w:sz w:val="24"/>
+        </w:rPr>
+        <w:t>2</w:t>
+      </w:r>
+      <w:r>
+        <w:rPr>
+          <w:rFonts w:ascii="宋体" w:hAnsi="宋体"/>
+          <w:sz w:val="24"/>
+        </w:rPr>
+        <w:t xml:space="preserve">. </w:t>
+      </w:r>
+      <w:r>
+        <w:rPr>
+          <w:rFonts w:hint="eastAsia" w:ascii="宋体" w:hAnsi="宋体"/>
+          <w:sz w:val="24"/>
+        </w:rPr>
+        <w:t>经费管理情况及存在问题</w:t>
       </w:r>
     </w:p>
     <w:p>
@@ -7771,13 +7311,12 @@
         <w:spacing w:before="120" w:beforeLines="50" w:line="276" w:lineRule="auto"/>
         <w:ind w:firstLine="440" w:firstLineChars="200"/>
         <w:rPr>
-          <w:rFonts w:hint="default" w:ascii="仿宋" w:hAnsi="仿宋" w:eastAsia="仿宋"/>
+          <w:rFonts w:hint="eastAsia" w:ascii="仿宋" w:hAnsi="仿宋" w:eastAsia="仿宋"/>
           <w:color w:val="C00000"/>
           <w:sz w:val="22"/>
           <w:lang w:val="en-US" w:eastAsia="zh-CN"/>
         </w:rPr>
       </w:pPr>
-      <w:commentRangeStart w:id="1"/>
       <w:r>
         <w:rPr>
           <w:rFonts w:hint="eastAsia" w:ascii="仿宋" w:hAnsi="仿宋" w:eastAsia="仿宋"/>
@@ -7785,26 +7324,51 @@
           <w:sz w:val="22"/>
           <w:lang w:val="en-US" w:eastAsia="zh-CN"/>
         </w:rPr>
-        <w:t>中海油研究总院有限责任公司/中海石油（中国）有限公司北京研究中心执行《企</w:t>
-      </w:r>
-      <w:commentRangeEnd w:id="1"/>
-      <w:r>
-        <w:commentReference w:id="1"/>
-      </w:r>
-      <w:r>
-        <w:rPr>
-          <w:rFonts w:hint="eastAsia" w:ascii="仿宋" w:hAnsi="仿宋" w:eastAsia="仿宋"/>
-          <w:color w:val="C00000"/>
-          <w:sz w:val="22"/>
-          <w:lang w:val="en-US" w:eastAsia="zh-CN"/>
-        </w:rPr>
-        <w:t>业会计准则》。依据集团公司、有限公司财务管理制度以及本单位实际情况，制定了涵盖预算管理、资金管理、费用报销、财务档案管理等制度，主要包括《中海油研究总院有限责任公司/中海石油（中国）有限公司北京研究中心财务管理制度》、《中海油研究总院有限责任公司/中海石油（中国）有限公司北京研究中心全面预算管理办法》、《中海油研究总院有限责任公司/中海石油（中国）有限公司北京研究中心科研项目财务管理办法》、《中海油研究总院有限责任公司/中海石油（中国）有限公司北京研究中心资金管理办法》、《中海油研究总院有限责任公司/中海石油（中国）有限公司北京研究中心会计核算办法》、《中海油研究总院有限责任公司集团公司科技课题经费预算管理细则》、《中海油研究总院有限责任公司/中海石油（中国）有限公司北京研究中心经费报销管理细则》、《中海油研究总院有限责任公司/中海石油（中国）有限公司北京研究中心境内差旅费管理细则》、《中海油研究总院有限责任公司/中海石油（中国）有限公司北京研究中心资金管理细则》、《中海油研究总院有限责任公司/中海石油（中国）有限公司北京研究中心会计档案管理细则》等。</w:t>
-      </w:r>
-      <w:bookmarkStart w:id="0" w:name="_GoBack"/>
-      <w:bookmarkEnd w:id="0"/>
+        <w:t>中海油研究总院有限责任公司/中海石油（中国）有限公司北京研究中心执行企业会计准则，建立了包括会计核算、计划预算管理、资金管理、差旅费管理、财务报告编制等一系列卓有成效的财务管理制度，并严格遵照执行。研究总院/研究中心在对专项经费会计核算时，采用中国海洋石油集团有限公司的ERP系统进行核算。项目（课题）专项经费核算以批复预算为依据，在ERP系统中按照预算支出科目设置明细的WBS元素实现刚性控制、单独核算和费用归集，会计核算规范、准确，支出范围和标准符合国家、集团公司/有限公司、研究总院/研究中心制度规定，财务信息真实有效，各项支出内容符合目标相关性、政策相符性及经济合理性。同时，根据《中海油研究总院有限责任公司会计档案管理细则》对相关的财务档案资料进行及时归档保管。</w:t>
+      </w:r>
     </w:p>
     <w:p>
       <w:pPr>
+        <w:spacing w:line="360" w:lineRule="auto"/>
+        <w:ind w:left="420" w:leftChars="200"/>
+        <w:rPr>
+          <w:sz w:val="24"/>
+        </w:rPr>
+      </w:pPr>
+    </w:p>
+    <w:p>
+      <w:pPr>
+        <w:spacing w:line="360" w:lineRule="auto"/>
+        <w:ind w:left="420" w:leftChars="200"/>
+        <w:rPr>
+          <w:rFonts w:ascii="宋体" w:hAnsi="宋体"/>
+          <w:sz w:val="24"/>
+        </w:rPr>
+      </w:pPr>
+      <w:r>
+        <w:rPr>
+          <w:rFonts w:hint="eastAsia" w:ascii="宋体" w:hAnsi="宋体"/>
+          <w:sz w:val="24"/>
+        </w:rPr>
+        <w:t>3</w:t>
+      </w:r>
+      <w:r>
+        <w:rPr>
+          <w:rFonts w:ascii="宋体" w:hAnsi="宋体"/>
+          <w:sz w:val="24"/>
+        </w:rPr>
+        <w:t xml:space="preserve">. </w:t>
+      </w:r>
+      <w:r>
+        <w:rPr>
+          <w:rFonts w:hint="eastAsia" w:ascii="宋体" w:hAnsi="宋体"/>
+          <w:sz w:val="24"/>
+        </w:rPr>
+        <w:t>相关建议</w:t>
+      </w:r>
+    </w:p>
+    <w:p>
+      <w:pPr>
         <w:spacing w:before="120" w:beforeLines="50" w:line="276" w:lineRule="auto"/>
         <w:ind w:firstLine="440" w:firstLineChars="200"/>
         <w:rPr>
@@ -7814,160 +7378,30 @@
           <w:lang w:val="en-US" w:eastAsia="zh-CN"/>
         </w:rPr>
       </w:pPr>
+      <w:r>
+        <w:rPr>
+          <w:rFonts w:hint="eastAsia" w:ascii="仿宋" w:hAnsi="仿宋" w:eastAsia="仿宋"/>
+          <w:color w:val="C00000"/>
+          <w:sz w:val="22"/>
+          <w:lang w:val="en-US" w:eastAsia="zh-CN"/>
+        </w:rPr>
+        <w:t>无</w:t>
+      </w:r>
     </w:p>
     <w:p>
       <w:pPr>
-        <w:spacing w:before="120" w:beforeLines="50" w:line="276" w:lineRule="auto"/>
-        <w:ind w:firstLine="440" w:firstLineChars="200"/>
-        <w:rPr>
-          <w:rFonts w:hint="default" w:ascii="仿宋" w:hAnsi="仿宋" w:eastAsia="仿宋"/>
-          <w:color w:val="C00000"/>
-          <w:sz w:val="22"/>
-          <w:lang w:val="en-US" w:eastAsia="zh-CN"/>
+        <w:spacing w:line="360" w:lineRule="auto"/>
+        <w:ind w:left="420" w:leftChars="200"/>
+        <w:rPr>
+          <w:sz w:val="24"/>
         </w:rPr>
       </w:pPr>
     </w:p>
     <w:p>
       <w:pPr>
-        <w:spacing w:line="360" w:lineRule="auto"/>
-        <w:ind w:left="420" w:leftChars="200"/>
-        <w:rPr>
-          <w:rFonts w:ascii="宋体" w:hAnsi="宋体"/>
-          <w:sz w:val="24"/>
-        </w:rPr>
-      </w:pPr>
-      <w:r>
-        <w:rPr>
-          <w:rFonts w:hint="eastAsia" w:ascii="宋体" w:hAnsi="宋体"/>
-          <w:sz w:val="24"/>
-        </w:rPr>
-        <w:t>2</w:t>
-      </w:r>
-      <w:r>
-        <w:rPr>
-          <w:rFonts w:ascii="宋体" w:hAnsi="宋体"/>
-          <w:sz w:val="24"/>
-        </w:rPr>
-        <w:t xml:space="preserve">. </w:t>
-      </w:r>
-      <w:r>
-        <w:rPr>
-          <w:rFonts w:hint="eastAsia" w:ascii="宋体" w:hAnsi="宋体"/>
-          <w:sz w:val="24"/>
-        </w:rPr>
-        <w:t>经费管理情况及存在问题</w:t>
-      </w:r>
-    </w:p>
-    <w:p>
-      <w:pPr>
-        <w:spacing w:before="120" w:beforeLines="50" w:line="276" w:lineRule="auto"/>
-        <w:ind w:firstLine="440" w:firstLineChars="200"/>
-        <w:rPr>
-          <w:rFonts w:hint="eastAsia" w:ascii="仿宋" w:hAnsi="仿宋" w:eastAsia="仿宋"/>
-          <w:color w:val="C00000"/>
-          <w:sz w:val="22"/>
-          <w:lang w:val="en-US" w:eastAsia="zh-CN"/>
-        </w:rPr>
-      </w:pPr>
-      <w:commentRangeStart w:id="2"/>
-      <w:r>
-        <w:rPr>
-          <w:rFonts w:hint="eastAsia" w:ascii="仿宋" w:hAnsi="仿宋" w:eastAsia="仿宋"/>
-          <w:color w:val="C00000"/>
-          <w:sz w:val="22"/>
-          <w:lang w:val="en-US" w:eastAsia="zh-CN"/>
-        </w:rPr>
-        <w:t>中海油研究总院有限责任公司/中海石油（中国）有限公司北京研究中心</w:t>
-      </w:r>
-      <w:commentRangeEnd w:id="2"/>
-      <w:r>
-        <w:commentReference w:id="2"/>
-      </w:r>
-      <w:r>
-        <w:rPr>
-          <w:rFonts w:hint="eastAsia" w:ascii="仿宋" w:hAnsi="仿宋" w:eastAsia="仿宋"/>
-          <w:color w:val="C00000"/>
-          <w:sz w:val="22"/>
-          <w:lang w:val="en-US" w:eastAsia="zh-CN"/>
-        </w:rPr>
-        <w:t>执行企业会计准则，建立了包括会计核算、计划预算管理、资金管理、差旅费管理、财务报告编制等一系列卓有成效的财务管理制度，并严格遵照执行。研究总院/研究中心在对专项经费会计核算时，采用中国海洋石油集团有限公司的ERP系统进行核算。项目（课题）专项经费核算以批复预算为依据，在ERP系统中按照预算支出科目设置明细的WBS元素实现刚性控制、单独核算和费用归集，会计核算规范、准确，支出范围和标准符合国家、集团公司/有限公司、研究总院/研究中心制度规定，财务信息真实有效，各项支出内容符合目标相关性、政策相符性及经济合理性。同时，根据《中海油研究总院有限责任公司会计档案管理细则》对相关的财务档案资料进行及时归档保管。</w:t>
-      </w:r>
-    </w:p>
-    <w:p>
-      <w:pPr>
-        <w:spacing w:line="360" w:lineRule="auto"/>
-        <w:ind w:left="420" w:leftChars="200"/>
-        <w:rPr>
-          <w:sz w:val="24"/>
-        </w:rPr>
-      </w:pPr>
-    </w:p>
-    <w:p>
-      <w:pPr>
-        <w:spacing w:line="360" w:lineRule="auto"/>
-        <w:ind w:left="420" w:leftChars="200"/>
-        <w:rPr>
-          <w:rFonts w:ascii="宋体" w:hAnsi="宋体"/>
-          <w:sz w:val="24"/>
-        </w:rPr>
-      </w:pPr>
-      <w:r>
-        <w:rPr>
-          <w:rFonts w:hint="eastAsia" w:ascii="宋体" w:hAnsi="宋体"/>
-          <w:sz w:val="24"/>
-        </w:rPr>
-        <w:t>3</w:t>
-      </w:r>
-      <w:r>
-        <w:rPr>
-          <w:rFonts w:ascii="宋体" w:hAnsi="宋体"/>
-          <w:sz w:val="24"/>
-        </w:rPr>
-        <w:t xml:space="preserve">. </w:t>
-      </w:r>
-      <w:r>
-        <w:rPr>
-          <w:rFonts w:hint="eastAsia" w:ascii="宋体" w:hAnsi="宋体"/>
-          <w:sz w:val="24"/>
-        </w:rPr>
-        <w:t>相关建议</w:t>
-      </w:r>
-    </w:p>
-    <w:p>
-      <w:pPr>
-        <w:spacing w:before="120" w:beforeLines="50" w:line="276" w:lineRule="auto"/>
-        <w:ind w:firstLine="440" w:firstLineChars="200"/>
-        <w:rPr>
-          <w:rFonts w:hint="eastAsia" w:ascii="仿宋" w:hAnsi="仿宋" w:eastAsia="仿宋"/>
-          <w:color w:val="C00000"/>
-          <w:sz w:val="22"/>
-          <w:lang w:val="en-US" w:eastAsia="zh-CN"/>
-        </w:rPr>
-      </w:pPr>
-      <w:r>
-        <w:rPr>
-          <w:rFonts w:hint="eastAsia" w:ascii="仿宋" w:hAnsi="仿宋" w:eastAsia="仿宋"/>
-          <w:color w:val="C00000"/>
-          <w:sz w:val="22"/>
-          <w:lang w:val="en-US" w:eastAsia="zh-CN"/>
-        </w:rPr>
-        <w:t>无</w:t>
-      </w:r>
-    </w:p>
-    <w:p>
-      <w:pPr>
-        <w:spacing w:line="360" w:lineRule="auto"/>
-        <w:ind w:left="420" w:leftChars="200"/>
-        <w:rPr>
-          <w:sz w:val="24"/>
-        </w:rPr>
-      </w:pPr>
-    </w:p>
-    <w:p>
-      <w:pPr>
         <w:numPr>
           <w:ilvl w:val="0"/>
-          <w:numId w:val="2"/>
+          <w:numId w:val="5"/>
         </w:numPr>
         <w:tabs>
           <w:tab w:val="left" w:pos="630"/>
@@ -8493,16 +7927,16 @@
               <w:spacing w:line="276" w:lineRule="auto"/>
               <w:jc w:val="left"/>
             </w:pPr>
-            <w:commentRangeStart w:id="3"/>
+            <w:commentRangeStart w:id="8"/>
             <w:r>
               <w:rPr>
                 <w:rFonts w:hint="eastAsia"/>
               </w:rPr>
               <w:t>批准概算额</w:t>
             </w:r>
-            <w:commentRangeEnd w:id="3"/>
-            <w:r>
-              <w:commentReference w:id="3"/>
+            <w:commentRangeEnd w:id="8"/>
+            <w:r>
+              <w:commentReference w:id="8"/>
             </w:r>
           </w:p>
         </w:tc>
@@ -8614,7 +8048,7 @@
                 </w14:textFill>
               </w:rPr>
             </w:pPr>
-            <w:commentRangeStart w:id="4"/>
+            <w:commentRangeStart w:id="9"/>
             <w:r>
               <w:rPr>
                 <w:color w:val="000000" w:themeColor="text1"/>
@@ -8638,9 +8072,9 @@
               </w:rPr>
               <w:t>年批准额</w:t>
             </w:r>
-            <w:commentRangeEnd w:id="4"/>
-            <w:r>
-              <w:commentReference w:id="4"/>
+            <w:commentRangeEnd w:id="9"/>
+            <w:r>
+              <w:commentReference w:id="9"/>
             </w:r>
           </w:p>
         </w:tc>
@@ -9195,7 +8629,7 @@
                 <w:b/>
               </w:rPr>
             </w:pPr>
-            <w:commentRangeStart w:id="5"/>
+            <w:commentRangeStart w:id="10"/>
             <w:r>
               <w:rPr>
                 <w:rFonts w:hint="eastAsia"/>
@@ -9203,9 +8637,9 @@
               </w:rPr>
               <w:t>预算额</w:t>
             </w:r>
-            <w:commentRangeEnd w:id="5"/>
-            <w:r>
-              <w:commentReference w:id="5"/>
+            <w:commentRangeEnd w:id="10"/>
+            <w:r>
+              <w:commentReference w:id="10"/>
             </w:r>
           </w:p>
         </w:tc>
@@ -9221,7 +8655,7 @@
                 <w:b/>
               </w:rPr>
             </w:pPr>
-            <w:commentRangeStart w:id="6"/>
+            <w:commentRangeStart w:id="11"/>
             <w:r>
               <w:rPr>
                 <w:rFonts w:hint="eastAsia"/>
@@ -9229,9 +8663,9 @@
               </w:rPr>
               <w:t>调整后的预算额</w:t>
             </w:r>
-            <w:commentRangeEnd w:id="6"/>
-            <w:r>
-              <w:commentReference w:id="6"/>
+            <w:commentRangeEnd w:id="11"/>
+            <w:r>
+              <w:commentReference w:id="11"/>
             </w:r>
           </w:p>
         </w:tc>
@@ -9247,7 +8681,7 @@
                 <w:b/>
               </w:rPr>
             </w:pPr>
-            <w:commentRangeStart w:id="7"/>
+            <w:commentRangeStart w:id="12"/>
             <w:r>
               <w:rPr>
                 <w:rFonts w:hint="eastAsia"/>
@@ -9255,9 +8689,9 @@
               </w:rPr>
               <w:t>支出额</w:t>
             </w:r>
-            <w:commentRangeEnd w:id="7"/>
-            <w:r>
-              <w:commentReference w:id="7"/>
+            <w:commentRangeEnd w:id="12"/>
+            <w:r>
+              <w:commentReference w:id="12"/>
             </w:r>
           </w:p>
         </w:tc>
@@ -9437,6 +8871,12 @@
             <w:insideH w:val="single" w:color="000000" w:sz="4" w:space="0"/>
             <w:insideV w:val="single" w:color="000000" w:sz="4" w:space="0"/>
           </w:tblBorders>
+          <w:tblCellMar>
+            <w:top w:w="0" w:type="dxa"/>
+            <w:left w:w="108" w:type="dxa"/>
+            <w:bottom w:w="0" w:type="dxa"/>
+            <w:right w:w="108" w:type="dxa"/>
+          </w:tblCellMar>
         </w:tblPrEx>
         <w:tc>
           <w:tcPr>
@@ -11275,7 +10715,7 @@
                 <w:b/>
               </w:rPr>
             </w:pPr>
-            <w:commentRangeStart w:id="8"/>
+            <w:commentRangeStart w:id="13"/>
             <w:r>
               <w:rPr>
                 <w:rFonts w:hint="eastAsia"/>
@@ -11283,9 +10723,9 @@
               </w:rPr>
               <w:t>预算额</w:t>
             </w:r>
-            <w:commentRangeEnd w:id="8"/>
-            <w:r>
-              <w:commentReference w:id="8"/>
+            <w:commentRangeEnd w:id="13"/>
+            <w:r>
+              <w:commentReference w:id="13"/>
             </w:r>
           </w:p>
         </w:tc>
@@ -12126,6 +11566,14 @@
         </w:rPr>
         <w:t>对于开展中试基地试验、海试或现场工业试验活动发生的设备费应在试验费科目归集，下同。</w:t>
       </w:r>
+    </w:p>
+    <w:p>
+      <w:pPr>
+        <w:jc w:val="left"/>
+        <w:rPr>
+          <w:sz w:val="24"/>
+        </w:rPr>
+      </w:pPr>
     </w:p>
     <w:p>
       <w:pPr>
@@ -12187,6 +11635,12 @@
             <w:insideH w:val="single" w:color="000000" w:sz="4" w:space="0"/>
             <w:insideV w:val="single" w:color="000000" w:sz="4" w:space="0"/>
           </w:tblBorders>
+          <w:tblCellMar>
+            <w:top w:w="0" w:type="dxa"/>
+            <w:left w:w="108" w:type="dxa"/>
+            <w:bottom w:w="0" w:type="dxa"/>
+            <w:right w:w="108" w:type="dxa"/>
+          </w:tblCellMar>
         </w:tblPrEx>
         <w:tc>
           <w:tcPr>
@@ -12315,7 +11769,7 @@
                 <w:b/>
               </w:rPr>
             </w:pPr>
-            <w:commentRangeStart w:id="9"/>
+            <w:commentRangeStart w:id="14"/>
             <w:r>
               <w:rPr>
                 <w:rFonts w:hint="eastAsia"/>
@@ -12323,9 +11777,9 @@
               </w:rPr>
               <w:t>预算额</w:t>
             </w:r>
-            <w:commentRangeEnd w:id="9"/>
-            <w:r>
-              <w:commentReference w:id="9"/>
+            <w:commentRangeEnd w:id="14"/>
+            <w:r>
+              <w:commentReference w:id="14"/>
             </w:r>
           </w:p>
         </w:tc>
@@ -12882,6 +12336,12 @@
             <w:insideH w:val="single" w:color="000000" w:sz="4" w:space="0"/>
             <w:insideV w:val="single" w:color="000000" w:sz="4" w:space="0"/>
           </w:tblBorders>
+          <w:tblCellMar>
+            <w:top w:w="0" w:type="dxa"/>
+            <w:left w:w="108" w:type="dxa"/>
+            <w:bottom w:w="0" w:type="dxa"/>
+            <w:right w:w="108" w:type="dxa"/>
+          </w:tblCellMar>
         </w:tblPrEx>
         <w:trPr>
           <w:trHeight w:val="467" w:hRule="atLeast"/>
@@ -12990,7 +12450,7 @@
                 <w:b/>
               </w:rPr>
             </w:pPr>
-            <w:commentRangeStart w:id="10"/>
+            <w:commentRangeStart w:id="15"/>
             <w:r>
               <w:rPr>
                 <w:rFonts w:hint="eastAsia"/>
@@ -12998,9 +12458,9 @@
               </w:rPr>
               <w:t>预算额</w:t>
             </w:r>
-            <w:commentRangeEnd w:id="10"/>
-            <w:r>
-              <w:commentReference w:id="10"/>
+            <w:commentRangeEnd w:id="15"/>
+            <w:r>
+              <w:commentReference w:id="15"/>
             </w:r>
           </w:p>
         </w:tc>
@@ -13619,6 +13079,25 @@
           <w:sz w:val="20"/>
         </w:rPr>
         <w:t>“说明”列请填写所属（子）课题序号。</w:t>
+      </w:r>
+    </w:p>
+    <w:p>
+      <w:pPr>
+        <w:widowControl/>
+        <w:jc w:val="left"/>
+        <w:rPr>
+          <w:b/>
+          <w:sz w:val="24"/>
+          <w:szCs w:val="18"/>
+        </w:rPr>
+      </w:pPr>
+      <w:r>
+        <w:rPr>
+          <w:b/>
+          <w:sz w:val="24"/>
+          <w:szCs w:val="18"/>
+        </w:rPr>
+        <w:br w:type="page"/>
       </w:r>
     </w:p>
     <w:p>
@@ -14770,7 +14249,7 @@
                 </w14:textFill>
               </w:rPr>
             </w:pPr>
-            <w:commentRangeStart w:id="11"/>
+            <w:commentRangeStart w:id="16"/>
             <w:r>
               <w:rPr>
                 <w:rFonts w:hint="eastAsia" w:ascii="宋体" w:hAnsi="宋体"/>
@@ -14785,9 +14264,9 @@
               </w:rPr>
               <w:t>原预算额：</w:t>
             </w:r>
-            <w:commentRangeEnd w:id="11"/>
-            <w:r>
-              <w:commentReference w:id="11"/>
+            <w:commentRangeEnd w:id="16"/>
+            <w:r>
+              <w:commentReference w:id="16"/>
             </w:r>
           </w:p>
         </w:tc>
@@ -15805,7 +15284,7 @@
                 </w14:textFill>
               </w:rPr>
             </w:pPr>
-            <w:commentRangeStart w:id="12"/>
+            <w:commentRangeStart w:id="17"/>
             <w:r>
               <w:rPr>
                 <w:rFonts w:hint="eastAsia" w:ascii="宋体" w:hAnsi="宋体"/>
@@ -15819,9 +15298,9 @@
               </w:rPr>
               <w:t>原预算额：</w:t>
             </w:r>
-            <w:commentRangeEnd w:id="12"/>
-            <w:r>
-              <w:commentReference w:id="12"/>
+            <w:commentRangeEnd w:id="17"/>
+            <w:r>
+              <w:commentReference w:id="17"/>
             </w:r>
           </w:p>
         </w:tc>
@@ -16057,7 +15536,7 @@
                 <w:szCs w:val="18"/>
               </w:rPr>
             </w:pPr>
-            <w:commentRangeStart w:id="13"/>
+            <w:commentRangeStart w:id="18"/>
             <w:r>
               <w:rPr>
                 <w:rFonts w:hint="eastAsia"/>
@@ -16066,9 +15545,9 @@
               </w:rPr>
               <w:t>预算额</w:t>
             </w:r>
-            <w:commentRangeEnd w:id="13"/>
-            <w:r>
-              <w:commentReference w:id="13"/>
+            <w:commentRangeEnd w:id="18"/>
+            <w:r>
+              <w:commentReference w:id="18"/>
             </w:r>
           </w:p>
         </w:tc>
@@ -16832,7 +16311,7 @@
                 <w:szCs w:val="18"/>
               </w:rPr>
             </w:pPr>
-            <w:commentRangeStart w:id="14"/>
+            <w:commentRangeStart w:id="19"/>
             <w:r>
               <w:rPr>
                 <w:rFonts w:hint="eastAsia"/>
@@ -16841,9 +16320,9 @@
               </w:rPr>
               <w:t>预算额</w:t>
             </w:r>
-            <w:commentRangeEnd w:id="14"/>
-            <w:r>
-              <w:commentReference w:id="14"/>
+            <w:commentRangeEnd w:id="19"/>
+            <w:r>
+              <w:commentReference w:id="19"/>
             </w:r>
           </w:p>
         </w:tc>
@@ -17531,6 +17010,12 @@
             <w:insideH w:val="single" w:color="auto" w:sz="4" w:space="0"/>
             <w:insideV w:val="single" w:color="auto" w:sz="4" w:space="0"/>
           </w:tblBorders>
+          <w:tblCellMar>
+            <w:top w:w="0" w:type="dxa"/>
+            <w:left w:w="108" w:type="dxa"/>
+            <w:bottom w:w="0" w:type="dxa"/>
+            <w:right w:w="108" w:type="dxa"/>
+          </w:tblCellMar>
         </w:tblPrEx>
         <w:tc>
           <w:tcPr>
@@ -18255,6 +17740,12 @@
             <w:insideH w:val="single" w:color="auto" w:sz="4" w:space="0"/>
             <w:insideV w:val="single" w:color="auto" w:sz="4" w:space="0"/>
           </w:tblBorders>
+          <w:tblCellMar>
+            <w:top w:w="0" w:type="dxa"/>
+            <w:left w:w="108" w:type="dxa"/>
+            <w:bottom w:w="0" w:type="dxa"/>
+            <w:right w:w="108" w:type="dxa"/>
+          </w:tblCellMar>
         </w:tblPrEx>
         <w:tc>
           <w:tcPr>
@@ -18903,6 +18394,12 @@
             <w:insideH w:val="single" w:color="auto" w:sz="4" w:space="0"/>
             <w:insideV w:val="single" w:color="auto" w:sz="4" w:space="0"/>
           </w:tblBorders>
+          <w:tblCellMar>
+            <w:top w:w="0" w:type="dxa"/>
+            <w:left w:w="108" w:type="dxa"/>
+            <w:bottom w:w="0" w:type="dxa"/>
+            <w:right w:w="108" w:type="dxa"/>
+          </w:tblCellMar>
         </w:tblPrEx>
         <w:tc>
           <w:tcPr>
@@ -19338,7 +18835,7 @@
           </w:tcPr>
           <w:p>
             <w:pPr>
-              <w:pStyle w:val="10"/>
+              <w:pStyle w:val="11"/>
               <w:rPr>
                 <w:b/>
                 <w:sz w:val="21"/>
@@ -19362,7 +18859,7 @@
           </w:tcPr>
           <w:p>
             <w:pPr>
-              <w:pStyle w:val="10"/>
+              <w:pStyle w:val="11"/>
               <w:jc w:val="center"/>
               <w:rPr>
                 <w:b/>
@@ -19397,7 +18894,7 @@
           </w:tcPr>
           <w:p>
             <w:pPr>
-              <w:pStyle w:val="10"/>
+              <w:pStyle w:val="11"/>
               <w:jc w:val="center"/>
               <w:rPr>
                 <w:b/>
@@ -19424,7 +18921,7 @@
           </w:tcPr>
           <w:p>
             <w:pPr>
-              <w:pStyle w:val="10"/>
+              <w:pStyle w:val="11"/>
               <w:jc w:val="center"/>
               <w:rPr>
                 <w:b/>
@@ -19452,7 +18949,7 @@
           </w:tcPr>
           <w:p>
             <w:pPr>
-              <w:pStyle w:val="10"/>
+              <w:pStyle w:val="11"/>
               <w:jc w:val="center"/>
               <w:rPr>
                 <w:b/>
@@ -19480,7 +18977,7 @@
           </w:tcPr>
           <w:p>
             <w:pPr>
-              <w:pStyle w:val="10"/>
+              <w:pStyle w:val="11"/>
               <w:jc w:val="center"/>
               <w:rPr>
                 <w:b/>
@@ -19489,7 +18986,7 @@
                 <w:szCs w:val="21"/>
               </w:rPr>
             </w:pPr>
-            <w:commentRangeStart w:id="15"/>
+            <w:commentRangeStart w:id="20"/>
             <w:r>
               <w:rPr>
                 <w:rFonts w:hint="eastAsia"/>
@@ -19500,9 +18997,9 @@
               </w:rPr>
               <w:t>预算额</w:t>
             </w:r>
-            <w:commentRangeEnd w:id="15"/>
-            <w:r>
-              <w:commentReference w:id="15"/>
+            <w:commentRangeEnd w:id="20"/>
+            <w:r>
+              <w:commentReference w:id="20"/>
             </w:r>
           </w:p>
         </w:tc>
@@ -19513,7 +19010,7 @@
           </w:tcPr>
           <w:p>
             <w:pPr>
-              <w:pStyle w:val="10"/>
+              <w:pStyle w:val="11"/>
               <w:jc w:val="center"/>
               <w:rPr>
                 <w:b/>
@@ -19541,7 +19038,7 @@
           </w:tcPr>
           <w:p>
             <w:pPr>
-              <w:pStyle w:val="10"/>
+              <w:pStyle w:val="11"/>
               <w:spacing w:line="276" w:lineRule="auto"/>
               <w:jc w:val="center"/>
               <w:rPr>
@@ -19570,7 +19067,7 @@
           </w:tcPr>
           <w:p>
             <w:pPr>
-              <w:pStyle w:val="10"/>
+              <w:pStyle w:val="11"/>
               <w:jc w:val="center"/>
               <w:rPr>
                 <w:b/>
@@ -19589,150 +19086,6 @@
               </w:rPr>
               <w:t>说明</w:t>
             </w:r>
-          </w:p>
-        </w:tc>
-      </w:tr>
-      <w:tr>
-        <w:tblPrEx>
-          <w:tblBorders>
-            <w:top w:val="single" w:color="auto" w:sz="4" w:space="0"/>
-            <w:left w:val="single" w:color="auto" w:sz="4" w:space="0"/>
-            <w:bottom w:val="single" w:color="auto" w:sz="4" w:space="0"/>
-            <w:right w:val="single" w:color="auto" w:sz="4" w:space="0"/>
-            <w:insideH w:val="single" w:color="auto" w:sz="4" w:space="0"/>
-            <w:insideV w:val="single" w:color="auto" w:sz="4" w:space="0"/>
-          </w:tblBorders>
-        </w:tblPrEx>
-        <w:tc>
-          <w:tcPr>
-            <w:tcW w:w="313" w:type="dxa"/>
-          </w:tcPr>
-          <w:p>
-            <w:pPr>
-              <w:spacing w:line="276" w:lineRule="auto"/>
-              <w:rPr>
-                <w:kern w:val="0"/>
-              </w:rPr>
-            </w:pPr>
-          </w:p>
-        </w:tc>
-        <w:tc>
-          <w:tcPr>
-            <w:tcW w:w="992" w:type="dxa"/>
-          </w:tcPr>
-          <w:p>
-            <w:pPr>
-              <w:spacing w:line="276" w:lineRule="auto"/>
-              <w:jc w:val="center"/>
-              <w:rPr>
-                <w:rFonts w:ascii="宋体" w:cs="宋体"/>
-                <w:color w:val="000000"/>
-                <w:kern w:val="0"/>
-              </w:rPr>
-            </w:pPr>
-          </w:p>
-        </w:tc>
-        <w:tc>
-          <w:tcPr>
-            <w:tcW w:w="1134" w:type="dxa"/>
-          </w:tcPr>
-          <w:p>
-            <w:pPr>
-              <w:spacing w:line="276" w:lineRule="auto"/>
-              <w:jc w:val="center"/>
-              <w:rPr>
-                <w:rFonts w:ascii="宋体" w:cs="宋体"/>
-                <w:kern w:val="0"/>
-              </w:rPr>
-            </w:pPr>
-          </w:p>
-        </w:tc>
-        <w:tc>
-          <w:tcPr>
-            <w:tcW w:w="1105" w:type="dxa"/>
-          </w:tcPr>
-          <w:p>
-            <w:pPr>
-              <w:spacing w:line="276" w:lineRule="auto"/>
-              <w:jc w:val="center"/>
-              <w:rPr>
-                <w:rFonts w:ascii="宋体" w:cs="宋体"/>
-                <w:kern w:val="0"/>
-              </w:rPr>
-            </w:pPr>
-          </w:p>
-        </w:tc>
-        <w:tc>
-          <w:tcPr>
-            <w:tcW w:w="1163" w:type="dxa"/>
-          </w:tcPr>
-          <w:p>
-            <w:pPr>
-              <w:spacing w:line="276" w:lineRule="auto"/>
-              <w:jc w:val="center"/>
-              <w:rPr>
-                <w:rFonts w:ascii="宋体" w:cs="宋体"/>
-                <w:kern w:val="0"/>
-              </w:rPr>
-            </w:pPr>
-          </w:p>
-        </w:tc>
-        <w:tc>
-          <w:tcPr>
-            <w:tcW w:w="964" w:type="dxa"/>
-          </w:tcPr>
-          <w:p>
-            <w:pPr>
-              <w:spacing w:line="276" w:lineRule="auto"/>
-              <w:jc w:val="center"/>
-              <w:rPr>
-                <w:rFonts w:ascii="宋体" w:cs="宋体"/>
-                <w:kern w:val="0"/>
-              </w:rPr>
-            </w:pPr>
-          </w:p>
-        </w:tc>
-        <w:tc>
-          <w:tcPr>
-            <w:tcW w:w="850" w:type="dxa"/>
-          </w:tcPr>
-          <w:p>
-            <w:pPr>
-              <w:spacing w:line="276" w:lineRule="auto"/>
-              <w:jc w:val="center"/>
-              <w:rPr>
-                <w:rFonts w:ascii="宋体" w:cs="宋体"/>
-                <w:kern w:val="0"/>
-              </w:rPr>
-            </w:pPr>
-          </w:p>
-        </w:tc>
-        <w:tc>
-          <w:tcPr>
-            <w:tcW w:w="709" w:type="dxa"/>
-          </w:tcPr>
-          <w:p>
-            <w:pPr>
-              <w:spacing w:line="276" w:lineRule="auto"/>
-              <w:rPr>
-                <w:rFonts w:ascii="宋体" w:cs="宋体"/>
-                <w:kern w:val="0"/>
-              </w:rPr>
-            </w:pPr>
-          </w:p>
-        </w:tc>
-        <w:tc>
-          <w:tcPr>
-            <w:tcW w:w="1446" w:type="dxa"/>
-          </w:tcPr>
-          <w:p>
-            <w:pPr>
-              <w:spacing w:line="276" w:lineRule="auto"/>
-              <w:rPr>
-                <w:rFonts w:ascii="宋体" w:cs="宋体"/>
-                <w:kern w:val="0"/>
-              </w:rPr>
-            </w:pPr>
           </w:p>
         </w:tc>
       </w:tr>
@@ -19773,8 +19126,10 @@
           <w:p>
             <w:pPr>
               <w:spacing w:line="276" w:lineRule="auto"/>
+              <w:jc w:val="center"/>
               <w:rPr>
                 <w:rFonts w:ascii="宋体" w:cs="宋体"/>
+                <w:color w:val="000000"/>
                 <w:kern w:val="0"/>
               </w:rPr>
             </w:pPr>
@@ -19787,6 +19142,7 @@
           <w:p>
             <w:pPr>
               <w:spacing w:line="276" w:lineRule="auto"/>
+              <w:jc w:val="center"/>
               <w:rPr>
                 <w:rFonts w:ascii="宋体" w:cs="宋体"/>
                 <w:kern w:val="0"/>
@@ -19801,6 +19157,7 @@
           <w:p>
             <w:pPr>
               <w:spacing w:line="276" w:lineRule="auto"/>
+              <w:jc w:val="center"/>
               <w:rPr>
                 <w:rFonts w:ascii="宋体" w:cs="宋体"/>
                 <w:kern w:val="0"/>
@@ -19815,6 +19172,7 @@
           <w:p>
             <w:pPr>
               <w:spacing w:line="276" w:lineRule="auto"/>
+              <w:jc w:val="center"/>
               <w:rPr>
                 <w:rFonts w:ascii="宋体" w:cs="宋体"/>
                 <w:kern w:val="0"/>
@@ -19829,6 +19187,7 @@
           <w:p>
             <w:pPr>
               <w:spacing w:line="276" w:lineRule="auto"/>
+              <w:jc w:val="center"/>
               <w:rPr>
                 <w:rFonts w:ascii="宋体" w:cs="宋体"/>
                 <w:kern w:val="0"/>
@@ -19843,6 +19202,7 @@
           <w:p>
             <w:pPr>
               <w:spacing w:line="276" w:lineRule="auto"/>
+              <w:jc w:val="center"/>
               <w:rPr>
                 <w:rFonts w:ascii="宋体" w:cs="宋体"/>
                 <w:kern w:val="0"/>
@@ -20032,6 +19392,155 @@
             <w:insideH w:val="single" w:color="auto" w:sz="4" w:space="0"/>
             <w:insideV w:val="single" w:color="auto" w:sz="4" w:space="0"/>
           </w:tblBorders>
+          <w:tblCellMar>
+            <w:top w:w="0" w:type="dxa"/>
+            <w:left w:w="108" w:type="dxa"/>
+            <w:bottom w:w="0" w:type="dxa"/>
+            <w:right w:w="108" w:type="dxa"/>
+          </w:tblCellMar>
+        </w:tblPrEx>
+        <w:tc>
+          <w:tcPr>
+            <w:tcW w:w="313" w:type="dxa"/>
+          </w:tcPr>
+          <w:p>
+            <w:pPr>
+              <w:spacing w:line="276" w:lineRule="auto"/>
+              <w:rPr>
+                <w:kern w:val="0"/>
+              </w:rPr>
+            </w:pPr>
+          </w:p>
+        </w:tc>
+        <w:tc>
+          <w:tcPr>
+            <w:tcW w:w="992" w:type="dxa"/>
+          </w:tcPr>
+          <w:p>
+            <w:pPr>
+              <w:spacing w:line="276" w:lineRule="auto"/>
+              <w:rPr>
+                <w:rFonts w:ascii="宋体" w:cs="宋体"/>
+                <w:kern w:val="0"/>
+              </w:rPr>
+            </w:pPr>
+          </w:p>
+        </w:tc>
+        <w:tc>
+          <w:tcPr>
+            <w:tcW w:w="1134" w:type="dxa"/>
+          </w:tcPr>
+          <w:p>
+            <w:pPr>
+              <w:spacing w:line="276" w:lineRule="auto"/>
+              <w:rPr>
+                <w:rFonts w:ascii="宋体" w:cs="宋体"/>
+                <w:kern w:val="0"/>
+              </w:rPr>
+            </w:pPr>
+          </w:p>
+        </w:tc>
+        <w:tc>
+          <w:tcPr>
+            <w:tcW w:w="1105" w:type="dxa"/>
+          </w:tcPr>
+          <w:p>
+            <w:pPr>
+              <w:spacing w:line="276" w:lineRule="auto"/>
+              <w:rPr>
+                <w:rFonts w:ascii="宋体" w:cs="宋体"/>
+                <w:kern w:val="0"/>
+              </w:rPr>
+            </w:pPr>
+          </w:p>
+        </w:tc>
+        <w:tc>
+          <w:tcPr>
+            <w:tcW w:w="1163" w:type="dxa"/>
+          </w:tcPr>
+          <w:p>
+            <w:pPr>
+              <w:spacing w:line="276" w:lineRule="auto"/>
+              <w:rPr>
+                <w:rFonts w:ascii="宋体" w:cs="宋体"/>
+                <w:kern w:val="0"/>
+              </w:rPr>
+            </w:pPr>
+          </w:p>
+        </w:tc>
+        <w:tc>
+          <w:tcPr>
+            <w:tcW w:w="964" w:type="dxa"/>
+          </w:tcPr>
+          <w:p>
+            <w:pPr>
+              <w:spacing w:line="276" w:lineRule="auto"/>
+              <w:rPr>
+                <w:rFonts w:ascii="宋体" w:cs="宋体"/>
+                <w:kern w:val="0"/>
+              </w:rPr>
+            </w:pPr>
+          </w:p>
+        </w:tc>
+        <w:tc>
+          <w:tcPr>
+            <w:tcW w:w="850" w:type="dxa"/>
+          </w:tcPr>
+          <w:p>
+            <w:pPr>
+              <w:spacing w:line="276" w:lineRule="auto"/>
+              <w:rPr>
+                <w:rFonts w:ascii="宋体" w:cs="宋体"/>
+                <w:kern w:val="0"/>
+              </w:rPr>
+            </w:pPr>
+          </w:p>
+        </w:tc>
+        <w:tc>
+          <w:tcPr>
+            <w:tcW w:w="709" w:type="dxa"/>
+          </w:tcPr>
+          <w:p>
+            <w:pPr>
+              <w:spacing w:line="276" w:lineRule="auto"/>
+              <w:rPr>
+                <w:rFonts w:ascii="宋体" w:cs="宋体"/>
+                <w:kern w:val="0"/>
+              </w:rPr>
+            </w:pPr>
+          </w:p>
+        </w:tc>
+        <w:tc>
+          <w:tcPr>
+            <w:tcW w:w="1446" w:type="dxa"/>
+          </w:tcPr>
+          <w:p>
+            <w:pPr>
+              <w:spacing w:line="276" w:lineRule="auto"/>
+              <w:rPr>
+                <w:rFonts w:ascii="宋体" w:cs="宋体"/>
+                <w:kern w:val="0"/>
+              </w:rPr>
+            </w:pPr>
+          </w:p>
+        </w:tc>
+      </w:tr>
+      <w:tr>
+        <w:tblPrEx>
+          <w:tblBorders>
+            <w:top w:val="single" w:color="auto" w:sz="4" w:space="0"/>
+            <w:left w:val="single" w:color="auto" w:sz="4" w:space="0"/>
+            <w:bottom w:val="single" w:color="auto" w:sz="4" w:space="0"/>
+            <w:right w:val="single" w:color="auto" w:sz="4" w:space="0"/>
+            <w:insideH w:val="single" w:color="auto" w:sz="4" w:space="0"/>
+            <w:insideV w:val="single" w:color="auto" w:sz="4" w:space="0"/>
+          </w:tblBorders>
+          <w:tblCellMar>
+            <w:top w:w="0" w:type="dxa"/>
+            <w:left w:w="108" w:type="dxa"/>
+            <w:bottom w:w="0" w:type="dxa"/>
+            <w:right w:w="108" w:type="dxa"/>
+          </w:tblCellMar>
         </w:tblPrEx>
         <w:tc>
           <w:tcPr>
@@ -20432,7 +19941,7 @@
                 <w:szCs w:val="21"/>
               </w:rPr>
             </w:pPr>
-            <w:commentRangeStart w:id="16"/>
+            <w:commentRangeStart w:id="21"/>
             <w:r>
               <w:rPr>
                 <w:rFonts w:hint="eastAsia"/>
@@ -20440,9 +19949,9 @@
               </w:rPr>
               <w:t>预算额</w:t>
             </w:r>
-            <w:commentRangeEnd w:id="16"/>
-            <w:r>
-              <w:commentReference w:id="16"/>
+            <w:commentRangeEnd w:id="21"/>
+            <w:r>
+              <w:commentReference w:id="21"/>
             </w:r>
           </w:p>
         </w:tc>
@@ -21243,7 +20752,7 @@
                 <w:szCs w:val="21"/>
               </w:rPr>
             </w:pPr>
-            <w:commentRangeStart w:id="17"/>
+            <w:commentRangeStart w:id="22"/>
             <w:r>
               <w:rPr>
                 <w:rFonts w:hint="eastAsia"/>
@@ -21251,9 +20760,9 @@
               </w:rPr>
               <w:t>预算额</w:t>
             </w:r>
-            <w:commentRangeEnd w:id="17"/>
-            <w:r>
-              <w:commentReference w:id="17"/>
+            <w:commentRangeEnd w:id="22"/>
+            <w:r>
+              <w:commentReference w:id="22"/>
             </w:r>
           </w:p>
         </w:tc>
@@ -22496,7 +22005,7 @@
                 <w:szCs w:val="21"/>
               </w:rPr>
             </w:pPr>
-            <w:commentRangeStart w:id="18"/>
+            <w:commentRangeStart w:id="23"/>
             <w:r>
               <w:rPr>
                 <w:rFonts w:hint="eastAsia" w:ascii="宋体" w:hAnsi="宋体"/>
@@ -22505,9 +22014,9 @@
               </w:rPr>
               <w:t>预算额</w:t>
             </w:r>
-            <w:commentRangeEnd w:id="18"/>
-            <w:r>
-              <w:commentReference w:id="18"/>
+            <w:commentRangeEnd w:id="23"/>
+            <w:r>
+              <w:commentReference w:id="23"/>
             </w:r>
           </w:p>
         </w:tc>
@@ -23104,7 +22613,7 @@
                 <w:szCs w:val="21"/>
               </w:rPr>
             </w:pPr>
-            <w:commentRangeStart w:id="19"/>
+            <w:commentRangeStart w:id="24"/>
             <w:r>
               <w:rPr>
                 <w:rFonts w:hint="eastAsia" w:ascii="宋体" w:hAnsi="宋体"/>
@@ -23113,9 +22622,9 @@
               </w:rPr>
               <w:t>预算额</w:t>
             </w:r>
-            <w:commentRangeEnd w:id="19"/>
-            <w:r>
-              <w:commentReference w:id="19"/>
+            <w:commentRangeEnd w:id="24"/>
+            <w:r>
+              <w:commentReference w:id="24"/>
             </w:r>
           </w:p>
         </w:tc>
@@ -23524,6 +23033,12 @@
             <w:insideH w:val="single" w:color="auto" w:sz="4" w:space="0"/>
             <w:insideV w:val="single" w:color="auto" w:sz="4" w:space="0"/>
           </w:tblBorders>
+          <w:tblCellMar>
+            <w:top w:w="0" w:type="dxa"/>
+            <w:left w:w="108" w:type="dxa"/>
+            <w:bottom w:w="0" w:type="dxa"/>
+            <w:right w:w="108" w:type="dxa"/>
+          </w:tblCellMar>
         </w:tblPrEx>
         <w:tc>
           <w:tcPr>
@@ -23619,6 +23134,12 @@
             <w:insideH w:val="single" w:color="auto" w:sz="4" w:space="0"/>
             <w:insideV w:val="single" w:color="auto" w:sz="4" w:space="0"/>
           </w:tblBorders>
+          <w:tblCellMar>
+            <w:top w:w="0" w:type="dxa"/>
+            <w:left w:w="108" w:type="dxa"/>
+            <w:bottom w:w="0" w:type="dxa"/>
+            <w:right w:w="108" w:type="dxa"/>
+          </w:tblCellMar>
         </w:tblPrEx>
         <w:tc>
           <w:tcPr>
@@ -24323,6 +23844,12 @@
             <w:insideH w:val="single" w:color="auto" w:sz="4" w:space="0"/>
             <w:insideV w:val="single" w:color="auto" w:sz="4" w:space="0"/>
           </w:tblBorders>
+          <w:tblCellMar>
+            <w:top w:w="0" w:type="dxa"/>
+            <w:left w:w="108" w:type="dxa"/>
+            <w:bottom w:w="0" w:type="dxa"/>
+            <w:right w:w="108" w:type="dxa"/>
+          </w:tblCellMar>
         </w:tblPrEx>
         <w:tc>
           <w:tcPr>
@@ -24566,6 +24093,12 @@
             <w:insideH w:val="single" w:color="auto" w:sz="4" w:space="0"/>
             <w:insideV w:val="single" w:color="auto" w:sz="4" w:space="0"/>
           </w:tblBorders>
+          <w:tblCellMar>
+            <w:top w:w="0" w:type="dxa"/>
+            <w:left w:w="108" w:type="dxa"/>
+            <w:bottom w:w="0" w:type="dxa"/>
+            <w:right w:w="108" w:type="dxa"/>
+          </w:tblCellMar>
         </w:tblPrEx>
         <w:tc>
           <w:tcPr>
@@ -24643,6 +24176,12 @@
             <w:insideH w:val="single" w:color="auto" w:sz="4" w:space="0"/>
             <w:insideV w:val="single" w:color="auto" w:sz="4" w:space="0"/>
           </w:tblBorders>
+          <w:tblCellMar>
+            <w:top w:w="0" w:type="dxa"/>
+            <w:left w:w="108" w:type="dxa"/>
+            <w:bottom w:w="0" w:type="dxa"/>
+            <w:right w:w="108" w:type="dxa"/>
+          </w:tblCellMar>
         </w:tblPrEx>
         <w:tc>
           <w:tcPr>
@@ -24748,40 +24287,6 @@
         </w:rPr>
         <w:t>注：依托工程的批准预算额是指生产部门下达生产计划任务文件时标识的科研成果试验示范配套内容，若没有的可不填。</w:t>
       </w:r>
-    </w:p>
-    <w:p/>
-    <w:p/>
-    <w:p/>
-    <w:p/>
-    <w:p/>
-    <w:p>
-      <w:pPr>
-        <w:keepNext w:val="0"/>
-        <w:keepLines w:val="0"/>
-        <w:pageBreakBefore w:val="0"/>
-        <w:widowControl w:val="0"/>
-        <w:kinsoku/>
-        <w:wordWrap/>
-        <w:overflowPunct/>
-        <w:topLinePunct w:val="0"/>
-        <w:autoSpaceDE/>
-        <w:autoSpaceDN/>
-        <w:bidi w:val="0"/>
-        <w:adjustRightInd/>
-        <w:snapToGrid/>
-        <w:spacing w:line="560" w:lineRule="exact"/>
-        <w:textAlignment w:val="auto"/>
-        <w:outlineLvl w:val="9"/>
-        <w:rPr>
-          <w:rFonts w:hint="eastAsia" w:ascii="仿宋_GB2312" w:hAnsi="仿宋_GB2312" w:eastAsia="仿宋_GB2312" w:cs="仿宋_GB2312"/>
-          <w:i w:val="0"/>
-          <w:iCs w:val="0"/>
-          <w:color w:val="auto"/>
-          <w:sz w:val="30"/>
-          <w:szCs w:val="30"/>
-          <w:highlight w:val="none"/>
-        </w:rPr>
-      </w:pPr>
     </w:p>
     <w:sectPr>
       <w:footerReference r:id="rId6" w:type="default"/>
@@ -24796,21 +24301,43 @@
 
 <file path=word/comments.xml><?xml version="1.0" encoding="utf-8"?>
 <w:comments xmlns:wpc="http://schemas.microsoft.com/office/word/2010/wordprocessingCanvas" xmlns:mc="http://schemas.openxmlformats.org/markup-compatibility/2006" xmlns:o="urn:schemas-microsoft-com:office:office" xmlns:r="http://schemas.openxmlformats.org/officeDocument/2006/relationships" xmlns:m="http://schemas.openxmlformats.org/officeDocument/2006/math" xmlns:v="urn:schemas-microsoft-com:vml" xmlns:wp14="http://schemas.microsoft.com/office/word/2010/wordprocessingDrawing" xmlns:wp="http://schemas.openxmlformats.org/drawingml/2006/wordprocessingDrawing" xmlns:w="http://schemas.openxmlformats.org/wordprocessingml/2006/main" xmlns:w14="http://schemas.microsoft.com/office/word/2010/wordml" xmlns:w15="http://schemas.microsoft.com/office/word/2012/wordml" xmlns:w10="urn:schemas-microsoft-com:office:word" xmlns:wpg="http://schemas.microsoft.com/office/word/2010/wordprocessingGroup" xmlns:wpi="http://schemas.microsoft.com/office/word/2010/wordprocessingInk" xmlns:wne="http://schemas.microsoft.com/office/word/2006/wordml" xmlns:wps="http://schemas.microsoft.com/office/word/2010/wordprocessingShape" xmlns:wpsCustomData="http://www.wps.cn/officeDocument/2013/wpsCustomData" mc:Ignorable="w14 w15 wp14">
-  <w:comment w:id="0" w:author="倪亚轩" w:date="2026-07-01T13:44:25Z" w:initials="倪">
+  <w:comment w:id="0" w:author="倪亚轩" w:date="2026-09-03T09:31:21Z" w:initials="倪">
     <w:p>
       <w:pPr>
         <w:pStyle w:val="2"/>
+        <w:rPr>
+          <w:rFonts w:hint="eastAsia" w:eastAsia="宋体"/>
+          <w:lang w:val="en-US" w:eastAsia="zh-CN"/>
+        </w:rPr>
       </w:pPr>
       <w:r>
         <w:rPr>
           <w:rFonts w:hint="eastAsia"/>
           <w:lang w:val="en-US" w:eastAsia="zh-CN"/>
         </w:rPr>
-        <w:t>本报告“批复概预算”均指任务合同书预算金额</w:t>
+        <w:t>请选择</w:t>
       </w:r>
     </w:p>
   </w:comment>
-  <w:comment w:id="1" w:author="倪亚轩" w:date="2026-08-31T15:10:39Z" w:initials="倪">
+  <w:comment w:id="1" w:author="倪亚轩" w:date="2026-09-03T09:31:28Z" w:initials="倪">
+    <w:p>
+      <w:pPr>
+        <w:pStyle w:val="2"/>
+        <w:rPr>
+          <w:rFonts w:hint="eastAsia" w:eastAsia="宋体"/>
+          <w:lang w:val="en-US" w:eastAsia="zh-CN"/>
+        </w:rPr>
+      </w:pPr>
+      <w:r>
+        <w:rPr>
+          <w:rFonts w:hint="eastAsia"/>
+          <w:lang w:val="en-US" w:eastAsia="zh-CN"/>
+        </w:rPr>
+        <w:t>请选择</w:t>
+      </w:r>
+    </w:p>
+  </w:comment>
+  <w:comment w:id="2" w:author="倪亚轩" w:date="2026-09-03T09:34:06Z" w:initials="倪">
     <w:p>
       <w:pPr>
         <w:pStyle w:val="2"/>
@@ -24824,25 +24351,264 @@
           <w:rFonts w:hint="eastAsia"/>
           <w:lang w:val="en-US" w:eastAsia="zh-CN"/>
         </w:rPr>
-        <w:t>按照实际承担单位保留“研究总院”或“研究中心”</w:t>
+        <w:t>财务（预）决算报告编制日（其中：财务决算报告日期需晚于集团公司/有限公司正式验收时间）</w:t>
       </w:r>
     </w:p>
   </w:comment>
-  <w:comment w:id="2" w:author="倪亚轩" w:date="2026-08-31T15:11:21Z" w:initials="倪">
+  <w:comment w:id="3" w:author="倪亚轩" w:date="2026-09-03T09:35:33Z" w:initials="倪">
     <w:p>
       <w:pPr>
         <w:pStyle w:val="2"/>
+        <w:rPr>
+          <w:rFonts w:hint="eastAsia" w:eastAsia="宋体"/>
+          <w:lang w:val="en-US" w:eastAsia="zh-CN"/>
+        </w:rPr>
       </w:pPr>
       <w:r>
         <w:rPr>
           <w:rFonts w:hint="eastAsia"/>
           <w:lang w:val="en-US" w:eastAsia="zh-CN"/>
         </w:rPr>
-        <w:t>按照实际承担单位保留“研究总院”或“研究中心”</w:t>
+        <w:t>请选择</w:t>
       </w:r>
     </w:p>
   </w:comment>
-  <w:comment w:id="3" w:author="倪亚轩" w:date="2026-07-01T10:16:29Z" w:initials="倪">
+  <w:comment w:id="4" w:author="倪亚轩" w:date="2026-09-03T09:35:45Z" w:initials="倪">
+    <w:p>
+      <w:pPr>
+        <w:pStyle w:val="2"/>
+        <w:rPr>
+          <w:rFonts w:hint="eastAsia" w:eastAsia="宋体"/>
+          <w:lang w:val="en-US" w:eastAsia="zh-CN"/>
+        </w:rPr>
+      </w:pPr>
+      <w:r>
+        <w:rPr>
+          <w:rFonts w:hint="eastAsia"/>
+          <w:lang w:val="en-US" w:eastAsia="zh-CN"/>
+        </w:rPr>
+        <w:t>请选择</w:t>
+      </w:r>
+    </w:p>
+  </w:comment>
+  <w:comment w:id="5" w:author="倪亚轩" w:date="2026-09-03T09:32:07Z" w:initials="倪">
+    <w:p>
+      <w:pPr>
+        <w:pStyle w:val="2"/>
+      </w:pPr>
+      <w:r>
+        <w:rPr>
+          <w:rFonts w:hint="eastAsia"/>
+          <w:lang w:val="en-US" w:eastAsia="zh-CN"/>
+        </w:rPr>
+        <w:t>本报告“批复概预算”均指任务合同书预算金额</w:t>
+      </w:r>
+    </w:p>
+  </w:comment>
+  <w:comment w:id="6" w:author="倪亚轩" w:date="2026-09-03T09:29:07Z" w:initials="倪">
+    <w:p>
+      <w:pPr>
+        <w:spacing w:line="360" w:lineRule="auto"/>
+        <w:ind w:firstLine="440" w:firstLineChars="200"/>
+        <w:rPr>
+          <w:rFonts w:hint="default" w:ascii="仿宋" w:hAnsi="仿宋" w:eastAsia="仿宋"/>
+          <w:color w:val="C00000"/>
+          <w:sz w:val="22"/>
+          <w:lang w:val="en-US" w:eastAsia="zh-CN"/>
+        </w:rPr>
+      </w:pPr>
+      <w:r>
+        <w:rPr>
+          <w:rFonts w:hint="eastAsia" w:ascii="仿宋" w:hAnsi="仿宋" w:eastAsia="仿宋"/>
+          <w:color w:val="C00000"/>
+          <w:sz w:val="22"/>
+          <w:lang w:val="en-US" w:eastAsia="zh-CN"/>
+        </w:rPr>
+        <w:t>概预算变更适用情形：</w:t>
+      </w:r>
+    </w:p>
+    <w:p>
+      <w:pPr>
+        <w:numPr>
+          <w:ilvl w:val="0"/>
+          <w:numId w:val="1"/>
+        </w:numPr>
+        <w:spacing w:line="360" w:lineRule="auto"/>
+        <w:ind w:firstLine="440" w:firstLineChars="200"/>
+        <w:rPr>
+          <w:rFonts w:hint="eastAsia" w:ascii="仿宋" w:hAnsi="仿宋" w:eastAsia="仿宋"/>
+          <w:color w:val="C00000"/>
+          <w:sz w:val="22"/>
+          <w:lang w:val="en-US" w:eastAsia="zh-CN"/>
+        </w:rPr>
+      </w:pPr>
+      <w:r>
+        <w:rPr>
+          <w:rFonts w:hint="eastAsia" w:ascii="仿宋" w:hAnsi="仿宋" w:eastAsia="仿宋"/>
+          <w:color w:val="C00000"/>
+          <w:sz w:val="22"/>
+          <w:lang w:val="en-US" w:eastAsia="zh-CN"/>
+        </w:rPr>
+        <w:t>重大变更事项</w:t>
+      </w:r>
+    </w:p>
+    <w:p>
+      <w:pPr>
+        <w:numPr>
+          <w:ilvl w:val="0"/>
+          <w:numId w:val="2"/>
+        </w:numPr>
+        <w:spacing w:line="360" w:lineRule="auto"/>
+        <w:ind w:left="5" w:leftChars="0" w:firstLine="415" w:firstLineChars="0"/>
+        <w:rPr>
+          <w:rFonts w:hint="default" w:ascii="仿宋" w:hAnsi="仿宋" w:eastAsia="仿宋"/>
+          <w:color w:val="C00000"/>
+          <w:sz w:val="22"/>
+          <w:lang w:val="en-US" w:eastAsia="zh-CN"/>
+        </w:rPr>
+      </w:pPr>
+      <w:r>
+        <w:rPr>
+          <w:rFonts w:hint="default" w:ascii="仿宋" w:hAnsi="仿宋" w:eastAsia="仿宋"/>
+          <w:color w:val="C00000"/>
+          <w:sz w:val="22"/>
+          <w:lang w:val="en-US" w:eastAsia="zh-CN"/>
+        </w:rPr>
+        <w:t>测试化验加工调增预算费用占本科目预算费用超 20%且额度超过 100 万元的</w:t>
+      </w:r>
+    </w:p>
+    <w:p>
+      <w:pPr>
+        <w:numPr>
+          <w:ilvl w:val="0"/>
+          <w:numId w:val="2"/>
+        </w:numPr>
+        <w:spacing w:line="360" w:lineRule="auto"/>
+        <w:ind w:left="5" w:leftChars="0" w:firstLine="415" w:firstLineChars="0"/>
+        <w:rPr>
+          <w:rFonts w:hint="default" w:ascii="仿宋" w:hAnsi="仿宋" w:eastAsia="仿宋"/>
+          <w:color w:val="C00000"/>
+          <w:sz w:val="22"/>
+          <w:lang w:val="en-US" w:eastAsia="zh-CN"/>
+        </w:rPr>
+      </w:pPr>
+      <w:r>
+        <w:rPr>
+          <w:rFonts w:hint="default" w:ascii="仿宋" w:hAnsi="仿宋" w:eastAsia="仿宋"/>
+          <w:color w:val="C00000"/>
+          <w:sz w:val="22"/>
+          <w:lang w:val="en-US" w:eastAsia="zh-CN"/>
+        </w:rPr>
+        <w:t>项目直接经费概算需要调增达50%以上的或者调增额2000万元以上，或者调增项目概算中集团资金预算的，或者调增项目概算中的设备与软件费或外委研究费科目预算的，或者从试验费科目调剂到其他科目的；</w:t>
+      </w:r>
+    </w:p>
+    <w:p>
+      <w:pPr>
+        <w:numPr>
+          <w:ilvl w:val="0"/>
+          <w:numId w:val="2"/>
+        </w:numPr>
+        <w:spacing w:line="360" w:lineRule="auto"/>
+        <w:ind w:left="5" w:leftChars="0" w:firstLine="415" w:firstLineChars="0"/>
+        <w:rPr>
+          <w:rFonts w:hint="default" w:ascii="仿宋" w:hAnsi="仿宋" w:eastAsia="仿宋"/>
+          <w:color w:val="C00000"/>
+          <w:sz w:val="22"/>
+          <w:lang w:val="en-US" w:eastAsia="zh-CN"/>
+        </w:rPr>
+      </w:pPr>
+      <w:r>
+        <w:rPr>
+          <w:rFonts w:hint="default" w:ascii="仿宋" w:hAnsi="仿宋" w:eastAsia="仿宋"/>
+          <w:color w:val="C00000"/>
+          <w:sz w:val="22"/>
+          <w:lang w:val="en-US" w:eastAsia="zh-CN"/>
+        </w:rPr>
+        <w:t>在项目年度预算批准下达后，需要调增其中集团资金年度预算的</w:t>
+      </w:r>
+    </w:p>
+    <w:p>
+      <w:pPr>
+        <w:numPr>
+          <w:ilvl w:val="0"/>
+          <w:numId w:val="1"/>
+        </w:numPr>
+        <w:spacing w:line="360" w:lineRule="auto"/>
+        <w:ind w:firstLine="440" w:firstLineChars="200"/>
+        <w:rPr>
+          <w:rFonts w:hint="eastAsia" w:ascii="仿宋" w:hAnsi="仿宋" w:eastAsia="仿宋"/>
+          <w:color w:val="C00000"/>
+          <w:sz w:val="22"/>
+          <w:lang w:val="en-US" w:eastAsia="zh-CN"/>
+        </w:rPr>
+      </w:pPr>
+      <w:r>
+        <w:rPr>
+          <w:rFonts w:hint="eastAsia" w:ascii="仿宋" w:hAnsi="仿宋" w:eastAsia="仿宋"/>
+          <w:color w:val="C00000"/>
+          <w:sz w:val="22"/>
+          <w:lang w:val="en-US" w:eastAsia="zh-CN"/>
+        </w:rPr>
+        <w:t>一般变更事项</w:t>
+      </w:r>
+    </w:p>
+    <w:p>
+      <w:pPr>
+        <w:numPr>
+          <w:ilvl w:val="0"/>
+          <w:numId w:val="3"/>
+        </w:numPr>
+        <w:spacing w:line="360" w:lineRule="auto"/>
+        <w:ind w:left="-5" w:leftChars="0" w:firstLine="425" w:firstLineChars="0"/>
+        <w:rPr>
+          <w:rFonts w:hint="eastAsia" w:ascii="仿宋" w:hAnsi="仿宋" w:eastAsia="仿宋"/>
+          <w:color w:val="C00000"/>
+          <w:sz w:val="22"/>
+          <w:lang w:val="en-US" w:eastAsia="zh-CN"/>
+        </w:rPr>
+      </w:pPr>
+      <w:r>
+        <w:rPr>
+          <w:rFonts w:hint="eastAsia" w:ascii="仿宋" w:hAnsi="仿宋" w:eastAsia="仿宋"/>
+          <w:color w:val="C00000"/>
+          <w:sz w:val="22"/>
+          <w:lang w:val="en-US" w:eastAsia="zh-CN"/>
+        </w:rPr>
+        <w:t>项目直接经费概算调增幅度在50%以下且调增额不超过2000万元，但不涉及集团资金预算调增的；</w:t>
+      </w:r>
+    </w:p>
+    <w:p>
+      <w:pPr>
+        <w:numPr>
+          <w:ilvl w:val="0"/>
+          <w:numId w:val="3"/>
+        </w:numPr>
+        <w:spacing w:line="360" w:lineRule="auto"/>
+        <w:ind w:left="-5" w:leftChars="0" w:firstLine="425" w:firstLineChars="0"/>
+        <w:rPr>
+          <w:rFonts w:hint="eastAsia" w:ascii="仿宋" w:hAnsi="仿宋" w:eastAsia="仿宋"/>
+          <w:color w:val="C00000"/>
+          <w:sz w:val="22"/>
+          <w:lang w:val="en-US" w:eastAsia="zh-CN"/>
+        </w:rPr>
+      </w:pPr>
+      <w:r>
+        <w:rPr>
+          <w:rFonts w:hint="eastAsia" w:ascii="仿宋" w:hAnsi="仿宋" w:eastAsia="仿宋"/>
+          <w:color w:val="C00000"/>
+          <w:sz w:val="22"/>
+          <w:lang w:val="en-US" w:eastAsia="zh-CN"/>
+        </w:rPr>
+        <w:t>在项目直接经费概算不变情况下，除重大变更中涉及设备与软件费及外委研究费科目的预算调增、测试化验加工预算调增以及试验费向其他科目的调剂情形以外，其他有关各科目之间的预算调剂；</w:t>
+      </w:r>
+    </w:p>
+    <w:p>
+      <w:pPr>
+        <w:pStyle w:val="2"/>
+      </w:pPr>
+    </w:p>
+  </w:comment>
+  <w:comment w:id="7" w:author="倪亚轩" w:date="2026-09-03T09:30:04Z" w:initials="倪">
     <w:p>
       <w:pPr>
         <w:pStyle w:val="2"/>
@@ -24856,11 +24622,11 @@
           <w:rFonts w:hint="eastAsia"/>
           <w:lang w:val="en-US" w:eastAsia="zh-CN"/>
         </w:rPr>
-        <w:t>任务合同书概预算额</w:t>
+        <w:t>根据承担单位，请选择“研究总院或研究中心”（文字描述及制度）</w:t>
       </w:r>
     </w:p>
   </w:comment>
-  <w:comment w:id="4" w:author="倪亚轩" w:date="2026-07-01T10:17:02Z" w:initials="倪">
+  <w:comment w:id="8" w:author="倪亚轩" w:date="2026-07-01T10:16:29Z" w:initials="倪">
     <w:p>
       <w:pPr>
         <w:pStyle w:val="2"/>
@@ -24874,11 +24640,11 @@
           <w:rFonts w:hint="eastAsia"/>
           <w:lang w:val="en-US" w:eastAsia="zh-CN"/>
         </w:rPr>
-        <w:t>年度正式预算额（实际下达）</w:t>
+        <w:t>任务合同书概预算额</w:t>
       </w:r>
     </w:p>
   </w:comment>
-  <w:comment w:id="5" w:author="倪亚轩" w:date="2026-07-01T10:17:50Z" w:initials="倪">
+  <w:comment w:id="9" w:author="倪亚轩" w:date="2026-07-01T10:17:02Z" w:initials="倪">
     <w:p>
       <w:pPr>
         <w:pStyle w:val="2"/>
@@ -24892,11 +24658,11 @@
           <w:rFonts w:hint="eastAsia"/>
           <w:lang w:val="en-US" w:eastAsia="zh-CN"/>
         </w:rPr>
-        <w:t>任务合同书概预算额</w:t>
+        <w:t>年度正式预算额（实际下达）</w:t>
       </w:r>
     </w:p>
   </w:comment>
-  <w:comment w:id="6" w:author="倪亚轩" w:date="2026-07-01T10:18:27Z" w:initials="倪">
+  <w:comment w:id="10" w:author="倪亚轩" w:date="2026-07-01T10:17:50Z" w:initials="倪">
     <w:p>
       <w:pPr>
         <w:pStyle w:val="2"/>
@@ -24910,11 +24676,11 @@
           <w:rFonts w:hint="eastAsia"/>
           <w:lang w:val="en-US" w:eastAsia="zh-CN"/>
         </w:rPr>
-        <w:t>任务合同书概算调整后金额（含重大变更及一般变更）</w:t>
+        <w:t>任务合同书概预算额</w:t>
       </w:r>
     </w:p>
   </w:comment>
-  <w:comment w:id="7" w:author="倪亚轩" w:date="2026-07-01T10:28:48Z" w:initials="倪">
+  <w:comment w:id="11" w:author="倪亚轩" w:date="2026-07-01T10:18:27Z" w:initials="倪">
     <w:p>
       <w:pPr>
         <w:pStyle w:val="2"/>
@@ -24928,11 +24694,29 @@
           <w:rFonts w:hint="eastAsia"/>
           <w:lang w:val="en-US" w:eastAsia="zh-CN"/>
         </w:rPr>
-        <w:t>支出额须与财务明细账保持一致</w:t>
+        <w:t>任务合同书概算调整后金额（含重大变更及一般变更）</w:t>
       </w:r>
     </w:p>
   </w:comment>
-  <w:comment w:id="8" w:author="倪亚轩" w:date="2026-07-01T10:29:20Z" w:initials="倪">
+  <w:comment w:id="12" w:author="倪亚轩" w:date="2026-07-01T10:28:48Z" w:initials="倪">
+    <w:p>
+      <w:pPr>
+        <w:pStyle w:val="2"/>
+        <w:rPr>
+          <w:rFonts w:hint="default" w:eastAsia="宋体"/>
+          <w:lang w:val="en-US" w:eastAsia="zh-CN"/>
+        </w:rPr>
+      </w:pPr>
+      <w:r>
+        <w:rPr>
+          <w:rFonts w:hint="eastAsia"/>
+          <w:lang w:val="en-US" w:eastAsia="zh-CN"/>
+        </w:rPr>
+        <w:t>支出额须与财务明细账保持一致</w:t>
+      </w:r>
+    </w:p>
+  </w:comment>
+  <w:comment w:id="13" w:author="倪亚轩" w:date="2026-07-01T10:29:20Z" w:initials="倪">
     <w:p>
       <w:pPr>
         <w:pStyle w:val="2"/>
@@ -24971,7 +24755,7 @@
       </w:r>
     </w:p>
   </w:comment>
-  <w:comment w:id="9" w:author="倪亚轩" w:date="2026-07-01T10:29:54Z" w:initials="倪">
+  <w:comment w:id="14" w:author="倪亚轩" w:date="2026-07-01T10:29:54Z" w:initials="倪">
     <w:p>
       <w:pPr>
         <w:pStyle w:val="2"/>
@@ -25004,7 +24788,7 @@
       </w:r>
     </w:p>
   </w:comment>
-  <w:comment w:id="10" w:author="倪亚轩" w:date="2026-07-01T10:30:02Z" w:initials="倪">
+  <w:comment w:id="15" w:author="倪亚轩" w:date="2026-07-01T10:30:02Z" w:initials="倪">
     <w:p>
       <w:pPr>
         <w:pStyle w:val="2"/>
@@ -25037,7 +24821,7 @@
       </w:r>
     </w:p>
   </w:comment>
-  <w:comment w:id="11" w:author="倪亚轩" w:date="2026-07-01T10:30:20Z" w:initials="倪">
+  <w:comment w:id="16" w:author="倪亚轩" w:date="2026-07-01T10:30:20Z" w:initials="倪">
     <w:p>
       <w:pPr>
         <w:pStyle w:val="2"/>
@@ -25070,7 +24854,7 @@
       </w:r>
     </w:p>
   </w:comment>
-  <w:comment w:id="12" w:author="倪亚轩" w:date="2026-07-01T10:30:30Z" w:initials="倪">
+  <w:comment w:id="17" w:author="倪亚轩" w:date="2026-07-01T10:30:30Z" w:initials="倪">
     <w:p>
       <w:pPr>
         <w:pStyle w:val="2"/>
@@ -25103,7 +24887,7 @@
       </w:r>
     </w:p>
   </w:comment>
-  <w:comment w:id="13" w:author="倪亚轩" w:date="2026-07-01T11:20:47Z" w:initials="倪">
+  <w:comment w:id="18" w:author="倪亚轩" w:date="2026-07-01T11:20:47Z" w:initials="倪">
     <w:p>
       <w:pPr>
         <w:pStyle w:val="2"/>
@@ -25136,7 +24920,7 @@
       </w:r>
     </w:p>
   </w:comment>
-  <w:comment w:id="14" w:author="倪亚轩" w:date="2026-07-01T11:20:54Z" w:initials="倪">
+  <w:comment w:id="19" w:author="倪亚轩" w:date="2026-07-01T11:20:54Z" w:initials="倪">
     <w:p>
       <w:pPr>
         <w:pStyle w:val="2"/>
@@ -25169,7 +24953,7 @@
       </w:r>
     </w:p>
   </w:comment>
-  <w:comment w:id="15" w:author="倪亚轩" w:date="2026-07-01T11:21:05Z" w:initials="倪">
+  <w:comment w:id="20" w:author="倪亚轩" w:date="2026-07-01T11:21:05Z" w:initials="倪">
     <w:p>
       <w:pPr>
         <w:pStyle w:val="2"/>
@@ -25202,7 +24986,7 @@
       </w:r>
     </w:p>
   </w:comment>
-  <w:comment w:id="16" w:author="倪亚轩" w:date="2026-07-01T11:21:11Z" w:initials="倪">
+  <w:comment w:id="21" w:author="倪亚轩" w:date="2026-07-01T11:21:11Z" w:initials="倪">
     <w:p>
       <w:pPr>
         <w:pStyle w:val="2"/>
@@ -25235,7 +25019,7 @@
       </w:r>
     </w:p>
   </w:comment>
-  <w:comment w:id="17" w:author="倪亚轩" w:date="2026-07-01T11:21:16Z" w:initials="倪">
+  <w:comment w:id="22" w:author="倪亚轩" w:date="2026-07-01T11:21:16Z" w:initials="倪">
     <w:p>
       <w:pPr>
         <w:pStyle w:val="2"/>
@@ -25268,7 +25052,7 @@
       </w:r>
     </w:p>
   </w:comment>
-  <w:comment w:id="18" w:author="倪亚轩" w:date="2026-07-01T11:21:26Z" w:initials="倪">
+  <w:comment w:id="23" w:author="倪亚轩" w:date="2026-07-01T11:21:26Z" w:initials="倪">
     <w:p>
       <w:pPr>
         <w:pStyle w:val="2"/>
@@ -25301,7 +25085,7 @@
       </w:r>
     </w:p>
   </w:comment>
-  <w:comment w:id="19" w:author="倪亚轩" w:date="2026-07-01T11:21:31Z" w:initials="倪">
+  <w:comment w:id="24" w:author="倪亚轩" w:date="2026-07-01T11:21:31Z" w:initials="倪">
     <w:p>
       <w:pPr>
         <w:pStyle w:val="2"/>
@@ -25339,26 +25123,31 @@
 
 <file path=word/commentsExtended.xml><?xml version="1.0" encoding="utf-8"?>
 <w15:commentsEx xmlns:wpc="http://schemas.microsoft.com/office/word/2010/wordprocessingCanvas" xmlns:mc="http://schemas.openxmlformats.org/markup-compatibility/2006" xmlns:o="urn:schemas-microsoft-com:office:office" xmlns:r="http://schemas.openxmlformats.org/officeDocument/2006/relationships" xmlns:m="http://schemas.openxmlformats.org/officeDocument/2006/math" xmlns:v="urn:schemas-microsoft-com:vml" xmlns:wp14="http://schemas.microsoft.com/office/word/2010/wordprocessingDrawing" xmlns:wp="http://schemas.openxmlformats.org/drawingml/2006/wordprocessingDrawing" xmlns:w="http://schemas.openxmlformats.org/wordprocessingml/2006/main" xmlns:w14="http://schemas.microsoft.com/office/word/2010/wordml" xmlns:w15="http://schemas.microsoft.com/office/word/2012/wordml" xmlns:w10="urn:schemas-microsoft-com:office:word" xmlns:wpg="http://schemas.microsoft.com/office/word/2010/wordprocessingGroup" xmlns:wpi="http://schemas.microsoft.com/office/word/2010/wordprocessingInk" xmlns:wne="http://schemas.microsoft.com/office/word/2006/wordml" xmlns:wps="http://schemas.microsoft.com/office/word/2010/wordprocessingShape" xmlns:wpsCustomData="http://www.wps.cn/officeDocument/2013/wpsCustomData" mc:Ignorable="w14 w15 wp14">
-  <w15:commentEx w15:paraId="23A8658E" w15:done="0"/>
-  <w15:commentEx w15:paraId="6E2971B6" w15:done="0"/>
-  <w15:commentEx w15:paraId="147505EE" w15:done="0"/>
-  <w15:commentEx w15:paraId="6FBD2FCA" w15:done="0"/>
-  <w15:commentEx w15:paraId="5D2205FD" w15:done="0"/>
-  <w15:commentEx w15:paraId="50E07576" w15:done="0"/>
-  <w15:commentEx w15:paraId="1FCA1862" w15:done="0"/>
-  <w15:commentEx w15:paraId="199D6E3A" w15:done="0"/>
-  <w15:commentEx w15:paraId="22F74549" w15:done="0"/>
-  <w15:commentEx w15:paraId="33F36949" w15:done="0"/>
-  <w15:commentEx w15:paraId="08B80809" w15:done="0"/>
-  <w15:commentEx w15:paraId="7B850444" w15:done="0"/>
-  <w15:commentEx w15:paraId="7BF47004" w15:done="0"/>
-  <w15:commentEx w15:paraId="75917349" w15:done="0"/>
-  <w15:commentEx w15:paraId="47FD48CF" w15:done="0"/>
-  <w15:commentEx w15:paraId="45260A2C" w15:done="0"/>
-  <w15:commentEx w15:paraId="0E680D94" w15:done="0"/>
-  <w15:commentEx w15:paraId="2F926B04" w15:done="0"/>
-  <w15:commentEx w15:paraId="0F1D2BB4" w15:done="0"/>
-  <w15:commentEx w15:paraId="451A7DEA" w15:done="0"/>
+  <w15:commentEx w15:paraId="5B2F4760" w15:done="0"/>
+  <w15:commentEx w15:paraId="219E7548" w15:done="0"/>
+  <w15:commentEx w15:paraId="278C7B2B" w15:done="0"/>
+  <w15:commentEx w15:paraId="39C83941" w15:done="0"/>
+  <w15:commentEx w15:paraId="162C68B0" w15:done="0"/>
+  <w15:commentEx w15:paraId="68883C11" w15:done="0"/>
+  <w15:commentEx w15:paraId="309D70B3" w15:done="0"/>
+  <w15:commentEx w15:paraId="27F1068B" w15:done="0"/>
+  <w15:commentEx w15:paraId="24886DA4" w15:done="0"/>
+  <w15:commentEx w15:paraId="2E5216CF" w15:done="0"/>
+  <w15:commentEx w15:paraId="3EFC4334" w15:done="0"/>
+  <w15:commentEx w15:paraId="029A764B" w15:done="0"/>
+  <w15:commentEx w15:paraId="32747069" w15:done="0"/>
+  <w15:commentEx w15:paraId="03453EDA" w15:done="0"/>
+  <w15:commentEx w15:paraId="2A73159E" w15:done="0"/>
+  <w15:commentEx w15:paraId="5A090845" w15:done="0"/>
+  <w15:commentEx w15:paraId="51762283" w15:done="0"/>
+  <w15:commentEx w15:paraId="51662667" w15:done="0"/>
+  <w15:commentEx w15:paraId="73272565" w15:done="0"/>
+  <w15:commentEx w15:paraId="287D128F" w15:done="0"/>
+  <w15:commentEx w15:paraId="0ED31FB0" w15:done="0"/>
+  <w15:commentEx w15:paraId="59250426" w15:done="0"/>
+  <w15:commentEx w15:paraId="6E1E03B2" w15:done="0"/>
+  <w15:commentEx w15:paraId="043C7C92" w15:done="0"/>
+  <w15:commentEx w15:paraId="13F63FA1" w15:done="0"/>
 </w15:commentsEx>
 </file>
 
@@ -25366,7 +25155,7 @@
 <w:ftr xmlns:wpc="http://schemas.microsoft.com/office/word/2010/wordprocessingCanvas" xmlns:mc="http://schemas.openxmlformats.org/markup-compatibility/2006" xmlns:o="urn:schemas-microsoft-com:office:office" xmlns:r="http://schemas.openxmlformats.org/officeDocument/2006/relationships" xmlns:m="http://schemas.openxmlformats.org/officeDocument/2006/math" xmlns:v="urn:schemas-microsoft-com:vml" xmlns:wp14="http://schemas.microsoft.com/office/word/2010/wordprocessingDrawing" xmlns:wp="http://schemas.openxmlformats.org/drawingml/2006/wordprocessingDrawing" xmlns:w10="urn:schemas-microsoft-com:office:word" xmlns:w="http://schemas.openxmlformats.org/wordprocessingml/2006/main" xmlns:w14="http://schemas.microsoft.com/office/word/2010/wordml" xmlns:w15="http://schemas.microsoft.com/office/word/2012/wordml" xmlns:wpg="http://schemas.microsoft.com/office/word/2010/wordprocessingGroup" xmlns:wpi="http://schemas.microsoft.com/office/word/2010/wordprocessingInk" xmlns:wne="http://schemas.microsoft.com/office/word/2006/wordml" xmlns:wps="http://schemas.microsoft.com/office/word/2010/wordprocessingShape" xmlns:wpsCustomData="http://www.wps.cn/officeDocument/2013/wpsCustomData" mc:Ignorable="w14 w15 wp14">
   <w:p>
     <w:pPr>
-      <w:pStyle w:val="3"/>
+      <w:pStyle w:val="4"/>
     </w:pPr>
     <w:r>
       <mc:AlternateContent>
@@ -25383,7 +25172,7 @@
               <wp:extent cx="1828800" cy="1828800"/>
               <wp:effectExtent l="0" t="0" r="0" b="0"/>
               <wp:wrapNone/>
-              <wp:docPr id="1" name="文本框 1"/>
+              <wp:docPr id="1" name="文本框 2"/>
               <wp:cNvGraphicFramePr/>
               <a:graphic xmlns:a="http://schemas.openxmlformats.org/drawingml/2006/main">
                 <a:graphicData uri="http://schemas.microsoft.com/office/word/2010/wordprocessingShape">
@@ -25407,7 +25196,7 @@
                       <w:txbxContent>
                         <w:p>
                           <w:pPr>
-                            <w:pStyle w:val="3"/>
+                            <w:pStyle w:val="4"/>
                           </w:pPr>
                           <w:r>
                             <w:fldChar w:fldCharType="begin"/>
@@ -25438,7 +25227,7 @@
         </mc:Choice>
         <mc:Fallback>
           <w:pict>
-            <v:shape id="_x0000_s1026" o:spid="_x0000_s1026" o:spt="202" type="#_x0000_t202" style="position:absolute;left:0pt;margin-top:0pt;height:144pt;width:144pt;mso-position-horizontal:center;mso-position-horizontal-relative:margin;mso-wrap-style:none;z-index:251659264;mso-width-relative:page;mso-height-relative:page;" filled="f" stroked="f" coordsize="21600,21600" o:gfxdata="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">
+            <v:shape id="文本框 2" o:spid="_x0000_s1026" o:spt="202" type="#_x0000_t202" style="position:absolute;left:0pt;margin-top:0pt;height:144pt;width:144pt;mso-position-horizontal:center;mso-position-horizontal-relative:margin;mso-wrap-style:none;z-index:251659264;mso-width-relative:page;mso-height-relative:page;" filled="f" stroked="f" coordsize="21600,21600" o:gfxdata="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">
               <v:fill on="f" focussize="0,0"/>
               <v:stroke on="f"/>
               <v:imagedata o:title=""/>
@@ -25447,7 +25236,7 @@
                 <w:txbxContent>
                   <w:p>
                     <w:pPr>
-                      <w:pStyle w:val="3"/>
+                      <w:pStyle w:val="4"/>
                     </w:pPr>
                     <w:r>
                       <w:fldChar w:fldCharType="begin"/>
@@ -25480,7 +25269,7 @@
 <w:ftr xmlns:wpc="http://schemas.microsoft.com/office/word/2010/wordprocessingCanvas" xmlns:mc="http://schemas.openxmlformats.org/markup-compatibility/2006" xmlns:o="urn:schemas-microsoft-com:office:office" xmlns:r="http://schemas.openxmlformats.org/officeDocument/2006/relationships" xmlns:m="http://schemas.openxmlformats.org/officeDocument/2006/math" xmlns:v="urn:schemas-microsoft-com:vml" xmlns:wp14="http://schemas.microsoft.com/office/word/2010/wordprocessingDrawing" xmlns:wp="http://schemas.openxmlformats.org/drawingml/2006/wordprocessingDrawing" xmlns:w10="urn:schemas-microsoft-com:office:word" xmlns:w="http://schemas.openxmlformats.org/wordprocessingml/2006/main" xmlns:w14="http://schemas.microsoft.com/office/word/2010/wordml" xmlns:w15="http://schemas.microsoft.com/office/word/2012/wordml" xmlns:wpg="http://schemas.microsoft.com/office/word/2010/wordprocessingGroup" xmlns:wpi="http://schemas.microsoft.com/office/word/2010/wordprocessingInk" xmlns:wne="http://schemas.microsoft.com/office/word/2006/wordml" xmlns:wps="http://schemas.microsoft.com/office/word/2010/wordprocessingShape" xmlns:wpsCustomData="http://www.wps.cn/officeDocument/2013/wpsCustomData" mc:Ignorable="w14 w15 wp14">
   <w:p>
     <w:pPr>
-      <w:pStyle w:val="3"/>
+      <w:pStyle w:val="4"/>
     </w:pPr>
   </w:p>
 </w:ftr>
@@ -25826,22 +25615,22 @@
     </w:lvl>
   </w:abstractNum>
   <w:num w:numId="1">
+    <w:abstractNumId w:val="2"/>
+  </w:num>
+  <w:num w:numId="2">
+    <w:abstractNumId w:val="1"/>
+  </w:num>
+  <w:num w:numId="3">
+    <w:abstractNumId w:val="5"/>
+  </w:num>
+  <w:num w:numId="4">
     <w:abstractNumId w:val="7"/>
   </w:num>
-  <w:num w:numId="2">
+  <w:num w:numId="5">
     <w:abstractNumId w:val="6"/>
   </w:num>
-  <w:num w:numId="3">
+  <w:num w:numId="6">
     <w:abstractNumId w:val="8"/>
-  </w:num>
-  <w:num w:numId="4">
-    <w:abstractNumId w:val="2"/>
-  </w:num>
-  <w:num w:numId="5">
-    <w:abstractNumId w:val="1"/>
-  </w:num>
-  <w:num w:numId="6">
-    <w:abstractNumId w:val="5"/>
   </w:num>
   <w:num w:numId="7">
     <w:abstractNumId w:val="0"/>
@@ -25868,162 +25657,162 @@
   <w:docDefaults>
     <w:rPrDefault>
       <w:rPr>
-        <w:rFonts w:asciiTheme="minorHAnsi" w:hAnsiTheme="minorHAnsi" w:eastAsiaTheme="minorEastAsia" w:cstheme="minorBidi"/>
+        <w:rFonts w:ascii="Times New Roman" w:hAnsi="Times New Roman" w:eastAsia="宋体" w:cs="Times New Roman"/>
       </w:rPr>
     </w:rPrDefault>
     <w:pPrDefault/>
   </w:docDefaults>
   <w:latentStyles w:count="260" w:defQFormat="0" w:defUnhideWhenUsed="1" w:defSemiHidden="1" w:defUIPriority="99" w:defLockedState="0">
     <w:lsdException w:qFormat="1" w:unhideWhenUsed="0" w:uiPriority="0" w:semiHidden="0" w:name="Normal"/>
-    <w:lsdException w:qFormat="1" w:unhideWhenUsed="0" w:uiPriority="0" w:semiHidden="0" w:name="heading 1"/>
-    <w:lsdException w:qFormat="1" w:uiPriority="0" w:name="heading 2"/>
-    <w:lsdException w:qFormat="1" w:uiPriority="0" w:name="heading 3"/>
-    <w:lsdException w:qFormat="1" w:uiPriority="0" w:name="heading 4"/>
-    <w:lsdException w:qFormat="1" w:uiPriority="0" w:name="heading 5"/>
-    <w:lsdException w:qFormat="1" w:uiPriority="0" w:name="heading 6"/>
-    <w:lsdException w:qFormat="1" w:uiPriority="0" w:name="heading 7"/>
-    <w:lsdException w:qFormat="1" w:uiPriority="0" w:name="heading 8"/>
-    <w:lsdException w:qFormat="1" w:uiPriority="0" w:name="heading 9"/>
-    <w:lsdException w:unhideWhenUsed="0" w:uiPriority="0" w:semiHidden="0" w:name="index 1"/>
-    <w:lsdException w:unhideWhenUsed="0" w:uiPriority="0" w:semiHidden="0" w:name="index 2"/>
-    <w:lsdException w:unhideWhenUsed="0" w:uiPriority="0" w:semiHidden="0" w:name="index 3"/>
-    <w:lsdException w:unhideWhenUsed="0" w:uiPriority="0" w:semiHidden="0" w:name="index 4"/>
-    <w:lsdException w:unhideWhenUsed="0" w:uiPriority="0" w:semiHidden="0" w:name="index 5"/>
-    <w:lsdException w:unhideWhenUsed="0" w:uiPriority="0" w:semiHidden="0" w:name="index 6"/>
-    <w:lsdException w:unhideWhenUsed="0" w:uiPriority="0" w:semiHidden="0" w:name="index 7"/>
-    <w:lsdException w:unhideWhenUsed="0" w:uiPriority="0" w:semiHidden="0" w:name="index 8"/>
-    <w:lsdException w:unhideWhenUsed="0" w:uiPriority="0" w:semiHidden="0" w:name="index 9"/>
-    <w:lsdException w:qFormat="1" w:unhideWhenUsed="0" w:uiPriority="39" w:semiHidden="0" w:name="toc 1"/>
-    <w:lsdException w:unhideWhenUsed="0" w:uiPriority="39" w:semiHidden="0" w:name="toc 2"/>
-    <w:lsdException w:unhideWhenUsed="0" w:uiPriority="0" w:semiHidden="0" w:name="toc 3"/>
-    <w:lsdException w:unhideWhenUsed="0" w:uiPriority="0" w:semiHidden="0" w:name="toc 4"/>
-    <w:lsdException w:unhideWhenUsed="0" w:uiPriority="0" w:semiHidden="0" w:name="toc 5"/>
-    <w:lsdException w:unhideWhenUsed="0" w:uiPriority="0" w:semiHidden="0" w:name="toc 6"/>
-    <w:lsdException w:unhideWhenUsed="0" w:uiPriority="0" w:semiHidden="0" w:name="toc 7"/>
-    <w:lsdException w:unhideWhenUsed="0" w:uiPriority="0" w:semiHidden="0" w:name="toc 8"/>
-    <w:lsdException w:unhideWhenUsed="0" w:uiPriority="0" w:semiHidden="0" w:name="toc 9"/>
-    <w:lsdException w:unhideWhenUsed="0" w:uiPriority="0" w:semiHidden="0" w:name="Normal Indent"/>
-    <w:lsdException w:unhideWhenUsed="0" w:uiPriority="0" w:semiHidden="0" w:name="footnote text"/>
+    <w:lsdException w:qFormat="1" w:unhideWhenUsed="0" w:uiPriority="9" w:semiHidden="0" w:name="heading 1"/>
+    <w:lsdException w:qFormat="1" w:uiPriority="9" w:name="heading 2"/>
+    <w:lsdException w:qFormat="1" w:uiPriority="9" w:name="heading 3"/>
+    <w:lsdException w:qFormat="1" w:uiPriority="9" w:name="heading 4"/>
+    <w:lsdException w:qFormat="1" w:uiPriority="9" w:name="heading 5"/>
+    <w:lsdException w:qFormat="1" w:uiPriority="9" w:name="heading 6"/>
+    <w:lsdException w:qFormat="1" w:uiPriority="9" w:name="heading 7"/>
+    <w:lsdException w:qFormat="1" w:uiPriority="9" w:name="heading 8"/>
+    <w:lsdException w:qFormat="1" w:uiPriority="9" w:name="heading 9"/>
+    <w:lsdException w:uiPriority="99" w:name="index 1"/>
+    <w:lsdException w:uiPriority="99" w:name="index 2"/>
+    <w:lsdException w:uiPriority="99" w:name="index 3"/>
+    <w:lsdException w:uiPriority="99" w:name="index 4"/>
+    <w:lsdException w:uiPriority="99" w:name="index 5"/>
+    <w:lsdException w:uiPriority="99" w:name="index 6"/>
+    <w:lsdException w:uiPriority="99" w:name="index 7"/>
+    <w:lsdException w:uiPriority="99" w:name="index 8"/>
+    <w:lsdException w:uiPriority="99" w:name="index 9"/>
+    <w:lsdException w:uiPriority="39" w:name="toc 1"/>
+    <w:lsdException w:uiPriority="39" w:name="toc 2"/>
+    <w:lsdException w:uiPriority="39" w:name="toc 3"/>
+    <w:lsdException w:uiPriority="39" w:name="toc 4"/>
+    <w:lsdException w:uiPriority="39" w:name="toc 5"/>
+    <w:lsdException w:uiPriority="39" w:name="toc 6"/>
+    <w:lsdException w:uiPriority="39" w:name="toc 7"/>
+    <w:lsdException w:uiPriority="39" w:name="toc 8"/>
+    <w:lsdException w:uiPriority="39" w:name="toc 9"/>
+    <w:lsdException w:uiPriority="99" w:name="Normal Indent"/>
+    <w:lsdException w:uiPriority="99" w:name="footnote text"/>
     <w:lsdException w:qFormat="1" w:uiPriority="99" w:name="annotation text"/>
-    <w:lsdException w:unhideWhenUsed="0" w:uiPriority="0" w:semiHidden="0" w:name="header"/>
+    <w:lsdException w:qFormat="1" w:uiPriority="99" w:semiHidden="0" w:name="header"/>
     <w:lsdException w:qFormat="1" w:unhideWhenUsed="0" w:uiPriority="99" w:semiHidden="0" w:name="footer"/>
-    <w:lsdException w:unhideWhenUsed="0" w:uiPriority="0" w:semiHidden="0" w:name="index heading"/>
-    <w:lsdException w:qFormat="1" w:uiPriority="0" w:name="caption"/>
-    <w:lsdException w:unhideWhenUsed="0" w:uiPriority="0" w:semiHidden="0" w:name="table of figures"/>
-    <w:lsdException w:unhideWhenUsed="0" w:uiPriority="0" w:semiHidden="0" w:name="envelope address"/>
-    <w:lsdException w:unhideWhenUsed="0" w:uiPriority="0" w:semiHidden="0" w:name="envelope return"/>
-    <w:lsdException w:unhideWhenUsed="0" w:uiPriority="0" w:semiHidden="0" w:name="footnote reference"/>
-    <w:lsdException w:unhideWhenUsed="0" w:uiPriority="0" w:semiHidden="0" w:name="annotation reference"/>
-    <w:lsdException w:unhideWhenUsed="0" w:uiPriority="0" w:semiHidden="0" w:name="line number"/>
-    <w:lsdException w:unhideWhenUsed="0" w:uiPriority="0" w:semiHidden="0" w:name="page number"/>
-    <w:lsdException w:unhideWhenUsed="0" w:uiPriority="0" w:semiHidden="0" w:name="endnote reference"/>
-    <w:lsdException w:unhideWhenUsed="0" w:uiPriority="0" w:semiHidden="0" w:name="endnote text"/>
-    <w:lsdException w:unhideWhenUsed="0" w:uiPriority="0" w:semiHidden="0" w:name="table of authorities"/>
-    <w:lsdException w:unhideWhenUsed="0" w:uiPriority="0" w:semiHidden="0" w:name="macro"/>
-    <w:lsdException w:unhideWhenUsed="0" w:uiPriority="0" w:semiHidden="0" w:name="toa heading"/>
-    <w:lsdException w:unhideWhenUsed="0" w:uiPriority="0" w:semiHidden="0" w:name="List"/>
-    <w:lsdException w:unhideWhenUsed="0" w:uiPriority="0" w:semiHidden="0" w:name="List Bullet"/>
-    <w:lsdException w:unhideWhenUsed="0" w:uiPriority="0" w:semiHidden="0" w:name="List Number"/>
-    <w:lsdException w:unhideWhenUsed="0" w:uiPriority="0" w:semiHidden="0" w:name="List 2"/>
-    <w:lsdException w:unhideWhenUsed="0" w:uiPriority="0" w:semiHidden="0" w:name="List 3"/>
-    <w:lsdException w:unhideWhenUsed="0" w:uiPriority="0" w:semiHidden="0" w:name="List 4"/>
-    <w:lsdException w:unhideWhenUsed="0" w:uiPriority="0" w:semiHidden="0" w:name="List 5"/>
-    <w:lsdException w:unhideWhenUsed="0" w:uiPriority="0" w:semiHidden="0" w:name="List Bullet 2"/>
-    <w:lsdException w:unhideWhenUsed="0" w:uiPriority="0" w:semiHidden="0" w:name="List Bullet 3"/>
-    <w:lsdException w:unhideWhenUsed="0" w:uiPriority="0" w:semiHidden="0" w:name="List Bullet 4"/>
-    <w:lsdException w:unhideWhenUsed="0" w:uiPriority="0" w:semiHidden="0" w:name="List Bullet 5"/>
-    <w:lsdException w:unhideWhenUsed="0" w:uiPriority="0" w:semiHidden="0" w:name="List Number 2"/>
-    <w:lsdException w:unhideWhenUsed="0" w:uiPriority="0" w:semiHidden="0" w:name="List Number 3"/>
-    <w:lsdException w:unhideWhenUsed="0" w:uiPriority="0" w:semiHidden="0" w:name="List Number 4"/>
-    <w:lsdException w:unhideWhenUsed="0" w:uiPriority="0" w:semiHidden="0" w:name="List Number 5"/>
-    <w:lsdException w:qFormat="1" w:unhideWhenUsed="0" w:uiPriority="0" w:semiHidden="0" w:name="Title"/>
-    <w:lsdException w:unhideWhenUsed="0" w:uiPriority="0" w:semiHidden="0" w:name="Closing"/>
-    <w:lsdException w:unhideWhenUsed="0" w:uiPriority="0" w:semiHidden="0" w:name="Signature"/>
-    <w:lsdException w:unhideWhenUsed="0" w:uiPriority="0" w:name="Default Paragraph Font"/>
-    <w:lsdException w:unhideWhenUsed="0" w:uiPriority="0" w:semiHidden="0" w:name="Body Text"/>
-    <w:lsdException w:unhideWhenUsed="0" w:uiPriority="0" w:semiHidden="0" w:name="Body Text Indent"/>
-    <w:lsdException w:unhideWhenUsed="0" w:uiPriority="0" w:semiHidden="0" w:name="List Continue"/>
-    <w:lsdException w:unhideWhenUsed="0" w:uiPriority="0" w:semiHidden="0" w:name="List Continue 2"/>
-    <w:lsdException w:unhideWhenUsed="0" w:uiPriority="0" w:semiHidden="0" w:name="List Continue 3"/>
-    <w:lsdException w:unhideWhenUsed="0" w:uiPriority="0" w:semiHidden="0" w:name="List Continue 4"/>
-    <w:lsdException w:unhideWhenUsed="0" w:uiPriority="0" w:semiHidden="0" w:name="List Continue 5"/>
-    <w:lsdException w:unhideWhenUsed="0" w:uiPriority="0" w:semiHidden="0" w:name="Message Header"/>
-    <w:lsdException w:qFormat="1" w:unhideWhenUsed="0" w:uiPriority="0" w:semiHidden="0" w:name="Subtitle"/>
-    <w:lsdException w:unhideWhenUsed="0" w:uiPriority="0" w:semiHidden="0" w:name="Salutation"/>
-    <w:lsdException w:unhideWhenUsed="0" w:uiPriority="0" w:semiHidden="0" w:name="Date"/>
-    <w:lsdException w:unhideWhenUsed="0" w:uiPriority="0" w:semiHidden="0" w:name="Body Text First Indent"/>
-    <w:lsdException w:unhideWhenUsed="0" w:uiPriority="0" w:semiHidden="0" w:name="Body Text First Indent 2"/>
-    <w:lsdException w:unhideWhenUsed="0" w:uiPriority="0" w:semiHidden="0" w:name="Note Heading"/>
-    <w:lsdException w:unhideWhenUsed="0" w:uiPriority="0" w:semiHidden="0" w:name="Body Text 2"/>
-    <w:lsdException w:unhideWhenUsed="0" w:uiPriority="0" w:semiHidden="0" w:name="Body Text 3"/>
-    <w:lsdException w:unhideWhenUsed="0" w:uiPriority="0" w:semiHidden="0" w:name="Body Text Indent 2"/>
-    <w:lsdException w:unhideWhenUsed="0" w:uiPriority="0" w:semiHidden="0" w:name="Body Text Indent 3"/>
-    <w:lsdException w:unhideWhenUsed="0" w:uiPriority="0" w:semiHidden="0" w:name="Block Text"/>
-    <w:lsdException w:unhideWhenUsed="0" w:uiPriority="0" w:semiHidden="0" w:name="Hyperlink"/>
-    <w:lsdException w:unhideWhenUsed="0" w:uiPriority="0" w:semiHidden="0" w:name="FollowedHyperlink"/>
-    <w:lsdException w:qFormat="1" w:unhideWhenUsed="0" w:uiPriority="0" w:semiHidden="0" w:name="Strong"/>
-    <w:lsdException w:qFormat="1" w:unhideWhenUsed="0" w:uiPriority="0" w:semiHidden="0" w:name="Emphasis"/>
-    <w:lsdException w:unhideWhenUsed="0" w:uiPriority="0" w:semiHidden="0" w:name="Document Map"/>
-    <w:lsdException w:unhideWhenUsed="0" w:uiPriority="0" w:semiHidden="0" w:name="Plain Text"/>
-    <w:lsdException w:unhideWhenUsed="0" w:uiPriority="0" w:semiHidden="0" w:name="E-mail Signature"/>
-    <w:lsdException w:unhideWhenUsed="0" w:uiPriority="0" w:semiHidden="0" w:name="Normal (Web)"/>
-    <w:lsdException w:unhideWhenUsed="0" w:uiPriority="0" w:semiHidden="0" w:name="HTML Acronym"/>
-    <w:lsdException w:unhideWhenUsed="0" w:uiPriority="0" w:semiHidden="0" w:name="HTML Address"/>
-    <w:lsdException w:unhideWhenUsed="0" w:uiPriority="0" w:semiHidden="0" w:name="HTML Cite"/>
-    <w:lsdException w:unhideWhenUsed="0" w:uiPriority="0" w:semiHidden="0" w:name="HTML Code"/>
-    <w:lsdException w:unhideWhenUsed="0" w:uiPriority="0" w:semiHidden="0" w:name="HTML Definition"/>
-    <w:lsdException w:unhideWhenUsed="0" w:uiPriority="0" w:semiHidden="0" w:name="HTML Keyboard"/>
-    <w:lsdException w:unhideWhenUsed="0" w:uiPriority="0" w:semiHidden="0" w:name="HTML Preformatted"/>
-    <w:lsdException w:unhideWhenUsed="0" w:uiPriority="0" w:semiHidden="0" w:name="HTML Sample"/>
-    <w:lsdException w:unhideWhenUsed="0" w:uiPriority="0" w:semiHidden="0" w:name="HTML Typewriter"/>
-    <w:lsdException w:unhideWhenUsed="0" w:uiPriority="0" w:semiHidden="0" w:name="HTML Variable"/>
-    <w:lsdException w:unhideWhenUsed="0" w:uiPriority="0" w:name="Normal Table"/>
-    <w:lsdException w:unhideWhenUsed="0" w:uiPriority="0" w:semiHidden="0" w:name="annotation subject"/>
-    <w:lsdException w:unhideWhenUsed="0" w:uiPriority="0" w:semiHidden="0" w:name="Table Simple 1"/>
-    <w:lsdException w:unhideWhenUsed="0" w:uiPriority="0" w:semiHidden="0" w:name="Table Simple 2"/>
-    <w:lsdException w:unhideWhenUsed="0" w:uiPriority="0" w:semiHidden="0" w:name="Table Simple 3"/>
-    <w:lsdException w:unhideWhenUsed="0" w:uiPriority="0" w:semiHidden="0" w:name="Table Classic 1"/>
-    <w:lsdException w:unhideWhenUsed="0" w:uiPriority="0" w:semiHidden="0" w:name="Table Classic 2"/>
-    <w:lsdException w:unhideWhenUsed="0" w:uiPriority="0" w:semiHidden="0" w:name="Table Classic 3"/>
-    <w:lsdException w:unhideWhenUsed="0" w:uiPriority="0" w:semiHidden="0" w:name="Table Classic 4"/>
-    <w:lsdException w:unhideWhenUsed="0" w:uiPriority="0" w:semiHidden="0" w:name="Table Colorful 1"/>
-    <w:lsdException w:unhideWhenUsed="0" w:uiPriority="0" w:semiHidden="0" w:name="Table Colorful 2"/>
-    <w:lsdException w:unhideWhenUsed="0" w:uiPriority="0" w:semiHidden="0" w:name="Table Colorful 3"/>
-    <w:lsdException w:unhideWhenUsed="0" w:uiPriority="0" w:semiHidden="0" w:name="Table Columns 1"/>
-    <w:lsdException w:unhideWhenUsed="0" w:uiPriority="0" w:semiHidden="0" w:name="Table Columns 2"/>
-    <w:lsdException w:unhideWhenUsed="0" w:uiPriority="0" w:semiHidden="0" w:name="Table Columns 3"/>
-    <w:lsdException w:unhideWhenUsed="0" w:uiPriority="0" w:semiHidden="0" w:name="Table Columns 4"/>
-    <w:lsdException w:unhideWhenUsed="0" w:uiPriority="0" w:semiHidden="0" w:name="Table Columns 5"/>
-    <w:lsdException w:unhideWhenUsed="0" w:uiPriority="0" w:semiHidden="0" w:name="Table Grid 1"/>
-    <w:lsdException w:unhideWhenUsed="0" w:uiPriority="0" w:semiHidden="0" w:name="Table Grid 2"/>
-    <w:lsdException w:unhideWhenUsed="0" w:uiPriority="0" w:semiHidden="0" w:name="Table Grid 3"/>
-    <w:lsdException w:unhideWhenUsed="0" w:uiPriority="0" w:semiHidden="0" w:name="Table Grid 4"/>
-    <w:lsdException w:unhideWhenUsed="0" w:uiPriority="0" w:semiHidden="0" w:name="Table Grid 5"/>
-    <w:lsdException w:unhideWhenUsed="0" w:uiPriority="0" w:semiHidden="0" w:name="Table Grid 6"/>
-    <w:lsdException w:unhideWhenUsed="0" w:uiPriority="0" w:semiHidden="0" w:name="Table Grid 7"/>
-    <w:lsdException w:unhideWhenUsed="0" w:uiPriority="0" w:semiHidden="0" w:name="Table Grid 8"/>
-    <w:lsdException w:unhideWhenUsed="0" w:uiPriority="0" w:semiHidden="0" w:name="Table List 1"/>
-    <w:lsdException w:unhideWhenUsed="0" w:uiPriority="0" w:semiHidden="0" w:name="Table List 2"/>
-    <w:lsdException w:unhideWhenUsed="0" w:uiPriority="0" w:semiHidden="0" w:name="Table List 3"/>
-    <w:lsdException w:unhideWhenUsed="0" w:uiPriority="0" w:semiHidden="0" w:name="Table List 4"/>
-    <w:lsdException w:unhideWhenUsed="0" w:uiPriority="0" w:semiHidden="0" w:name="Table List 5"/>
-    <w:lsdException w:unhideWhenUsed="0" w:uiPriority="0" w:semiHidden="0" w:name="Table List 6"/>
-    <w:lsdException w:unhideWhenUsed="0" w:uiPriority="0" w:semiHidden="0" w:name="Table List 7"/>
-    <w:lsdException w:unhideWhenUsed="0" w:uiPriority="0" w:semiHidden="0" w:name="Table List 8"/>
-    <w:lsdException w:unhideWhenUsed="0" w:uiPriority="0" w:semiHidden="0" w:name="Table 3D effects 1"/>
-    <w:lsdException w:unhideWhenUsed="0" w:uiPriority="0" w:semiHidden="0" w:name="Table 3D effects 2"/>
-    <w:lsdException w:unhideWhenUsed="0" w:uiPriority="0" w:semiHidden="0" w:name="Table 3D effects 3"/>
-    <w:lsdException w:unhideWhenUsed="0" w:uiPriority="0" w:semiHidden="0" w:name="Table Contemporary"/>
-    <w:lsdException w:unhideWhenUsed="0" w:uiPriority="0" w:semiHidden="0" w:name="Table Elegant"/>
-    <w:lsdException w:unhideWhenUsed="0" w:uiPriority="0" w:semiHidden="0" w:name="Table Professional"/>
-    <w:lsdException w:unhideWhenUsed="0" w:uiPriority="0" w:semiHidden="0" w:name="Table Subtle 1"/>
-    <w:lsdException w:unhideWhenUsed="0" w:uiPriority="0" w:semiHidden="0" w:name="Table Subtle 2"/>
-    <w:lsdException w:unhideWhenUsed="0" w:uiPriority="0" w:semiHidden="0" w:name="Table Web 1"/>
-    <w:lsdException w:unhideWhenUsed="0" w:uiPriority="0" w:semiHidden="0" w:name="Table Web 2"/>
-    <w:lsdException w:unhideWhenUsed="0" w:uiPriority="0" w:semiHidden="0" w:name="Table Web 3"/>
-    <w:lsdException w:unhideWhenUsed="0" w:uiPriority="0" w:semiHidden="0" w:name="Balloon Text"/>
+    <w:lsdException w:uiPriority="99" w:name="index heading"/>
+    <w:lsdException w:qFormat="1" w:uiPriority="35" w:name="caption"/>
+    <w:lsdException w:uiPriority="99" w:name="table of figures"/>
+    <w:lsdException w:uiPriority="99" w:name="envelope address"/>
+    <w:lsdException w:uiPriority="99" w:name="envelope return"/>
+    <w:lsdException w:uiPriority="99" w:name="footnote reference"/>
+    <w:lsdException w:uiPriority="99" w:name="annotation reference"/>
+    <w:lsdException w:uiPriority="99" w:name="line number"/>
+    <w:lsdException w:uiPriority="99" w:name="page number"/>
+    <w:lsdException w:uiPriority="99" w:name="endnote reference"/>
+    <w:lsdException w:uiPriority="99" w:name="endnote text"/>
+    <w:lsdException w:uiPriority="99" w:name="table of authorities"/>
+    <w:lsdException w:uiPriority="99" w:name="macro"/>
+    <w:lsdException w:uiPriority="99" w:name="toa heading"/>
+    <w:lsdException w:uiPriority="99" w:name="List"/>
+    <w:lsdException w:uiPriority="99" w:name="List Bullet"/>
+    <w:lsdException w:uiPriority="99" w:name="List Number"/>
+    <w:lsdException w:uiPriority="99" w:name="List 2"/>
+    <w:lsdException w:uiPriority="99" w:name="List 3"/>
+    <w:lsdException w:uiPriority="99" w:name="List 4"/>
+    <w:lsdException w:uiPriority="99" w:name="List 5"/>
+    <w:lsdException w:uiPriority="99" w:name="List Bullet 2"/>
+    <w:lsdException w:uiPriority="99" w:name="List Bullet 3"/>
+    <w:lsdException w:uiPriority="99" w:name="List Bullet 4"/>
+    <w:lsdException w:uiPriority="99" w:name="List Bullet 5"/>
+    <w:lsdException w:uiPriority="99" w:name="List Number 2"/>
+    <w:lsdException w:uiPriority="99" w:name="List Number 3"/>
+    <w:lsdException w:uiPriority="99" w:name="List Number 4"/>
+    <w:lsdException w:uiPriority="99" w:name="List Number 5"/>
+    <w:lsdException w:qFormat="1" w:unhideWhenUsed="0" w:uiPriority="10" w:semiHidden="0" w:name="Title"/>
+    <w:lsdException w:uiPriority="99" w:name="Closing"/>
+    <w:lsdException w:uiPriority="99" w:name="Signature"/>
+    <w:lsdException w:qFormat="1" w:uiPriority="1" w:name="Default Paragraph Font"/>
+    <w:lsdException w:uiPriority="99" w:name="Body Text"/>
+    <w:lsdException w:uiPriority="99" w:name="Body Text Indent"/>
+    <w:lsdException w:uiPriority="99" w:name="List Continue"/>
+    <w:lsdException w:uiPriority="99" w:name="List Continue 2"/>
+    <w:lsdException w:uiPriority="99" w:name="List Continue 3"/>
+    <w:lsdException w:uiPriority="99" w:name="List Continue 4"/>
+    <w:lsdException w:uiPriority="99" w:name="List Continue 5"/>
+    <w:lsdException w:uiPriority="99" w:name="Message Header"/>
+    <w:lsdException w:qFormat="1" w:unhideWhenUsed="0" w:uiPriority="11" w:semiHidden="0" w:name="Subtitle"/>
+    <w:lsdException w:uiPriority="99" w:name="Salutation"/>
+    <w:lsdException w:uiPriority="99" w:name="Date"/>
+    <w:lsdException w:uiPriority="99" w:name="Body Text First Indent"/>
+    <w:lsdException w:uiPriority="99" w:name="Body Text First Indent 2"/>
+    <w:lsdException w:uiPriority="99" w:name="Note Heading"/>
+    <w:lsdException w:uiPriority="99" w:name="Body Text 2"/>
+    <w:lsdException w:uiPriority="99" w:name="Body Text 3"/>
+    <w:lsdException w:uiPriority="99" w:name="Body Text Indent 2"/>
+    <w:lsdException w:uiPriority="99" w:name="Body Text Indent 3"/>
+    <w:lsdException w:uiPriority="99" w:name="Block Text"/>
+    <w:lsdException w:uiPriority="99" w:name="Hyperlink"/>
+    <w:lsdException w:uiPriority="99" w:name="FollowedHyperlink"/>
+    <w:lsdException w:qFormat="1" w:unhideWhenUsed="0" w:uiPriority="22" w:semiHidden="0" w:name="Strong"/>
+    <w:lsdException w:qFormat="1" w:unhideWhenUsed="0" w:uiPriority="20" w:semiHidden="0" w:name="Emphasis"/>
+    <w:lsdException w:uiPriority="99" w:name="Document Map"/>
+    <w:lsdException w:uiPriority="99" w:name="Plain Text"/>
+    <w:lsdException w:uiPriority="99" w:name="E-mail Signature"/>
+    <w:lsdException w:uiPriority="99" w:name="Normal (Web)"/>
+    <w:lsdException w:uiPriority="99" w:name="HTML Acronym"/>
+    <w:lsdException w:uiPriority="99" w:name="HTML Address"/>
+    <w:lsdException w:uiPriority="99" w:name="HTML Cite"/>
+    <w:lsdException w:uiPriority="99" w:name="HTML Code"/>
+    <w:lsdException w:uiPriority="99" w:name="HTML Definition"/>
+    <w:lsdException w:uiPriority="99" w:name="HTML Keyboard"/>
+    <w:lsdException w:uiPriority="99" w:name="HTML Preformatted"/>
+    <w:lsdException w:uiPriority="99" w:name="HTML Sample"/>
+    <w:lsdException w:uiPriority="99" w:name="HTML Typewriter"/>
+    <w:lsdException w:uiPriority="99" w:name="HTML Variable"/>
+    <w:lsdException w:qFormat="1" w:uiPriority="99" w:name="Normal Table"/>
+    <w:lsdException w:uiPriority="99" w:name="annotation subject"/>
+    <w:lsdException w:uiPriority="99" w:name="Table Simple 1"/>
+    <w:lsdException w:uiPriority="99" w:name="Table Simple 2"/>
+    <w:lsdException w:uiPriority="99" w:name="Table Simple 3"/>
+    <w:lsdException w:uiPriority="99" w:name="Table Classic 1"/>
+    <w:lsdException w:uiPriority="99" w:name="Table Classic 2"/>
+    <w:lsdException w:uiPriority="99" w:name="Table Classic 3"/>
+    <w:lsdException w:uiPriority="99" w:name="Table Classic 4"/>
+    <w:lsdException w:uiPriority="99" w:name="Table Colorful 1"/>
+    <w:lsdException w:uiPriority="99" w:name="Table Colorful 2"/>
+    <w:lsdException w:uiPriority="99" w:name="Table Colorful 3"/>
+    <w:lsdException w:uiPriority="99" w:name="Table Columns 1"/>
+    <w:lsdException w:uiPriority="99" w:name="Table Columns 2"/>
+    <w:lsdException w:uiPriority="99" w:name="Table Columns 3"/>
+    <w:lsdException w:uiPriority="99" w:name="Table Columns 4"/>
+    <w:lsdException w:uiPriority="99" w:name="Table Columns 5"/>
+    <w:lsdException w:uiPriority="99" w:name="Table Grid 1"/>
+    <w:lsdException w:uiPriority="99" w:name="Table Grid 2"/>
+    <w:lsdException w:uiPriority="99" w:name="Table Grid 3"/>
+    <w:lsdException w:uiPriority="99" w:name="Table Grid 4"/>
+    <w:lsdException w:uiPriority="99" w:name="Table Grid 5"/>
+    <w:lsdException w:uiPriority="99" w:name="Table Grid 6"/>
+    <w:lsdException w:uiPriority="99" w:name="Table Grid 7"/>
+    <w:lsdException w:uiPriority="99" w:name="Table Grid 8"/>
+    <w:lsdException w:uiPriority="99" w:name="Table List 1"/>
+    <w:lsdException w:uiPriority="99" w:name="Table List 2"/>
+    <w:lsdException w:uiPriority="99" w:name="Table List 3"/>
+    <w:lsdException w:uiPriority="99" w:name="Table List 4"/>
+    <w:lsdException w:uiPriority="99" w:name="Table List 5"/>
+    <w:lsdException w:uiPriority="99" w:name="Table List 6"/>
+    <w:lsdException w:uiPriority="99" w:name="Table List 7"/>
+    <w:lsdException w:uiPriority="99" w:name="Table List 8"/>
+    <w:lsdException w:uiPriority="99" w:name="Table 3D effects 1"/>
+    <w:lsdException w:uiPriority="99" w:name="Table 3D effects 2"/>
+    <w:lsdException w:uiPriority="99" w:name="Table 3D effects 3"/>
+    <w:lsdException w:uiPriority="99" w:name="Table Contemporary"/>
+    <w:lsdException w:uiPriority="99" w:name="Table Elegant"/>
+    <w:lsdException w:uiPriority="99" w:name="Table Professional"/>
+    <w:lsdException w:uiPriority="99" w:name="Table Subtle 1"/>
+    <w:lsdException w:uiPriority="99" w:name="Table Subtle 2"/>
+    <w:lsdException w:uiPriority="99" w:name="Table Web 1"/>
+    <w:lsdException w:uiPriority="99" w:name="Table Web 2"/>
+    <w:lsdException w:uiPriority="99" w:name="Table Web 3"/>
+    <w:lsdException w:qFormat="1" w:uiPriority="99" w:name="Balloon Text"/>
     <w:lsdException w:qFormat="1" w:unhideWhenUsed="0" w:uiPriority="39" w:semiHidden="0" w:name="Table Grid"/>
-    <w:lsdException w:unhideWhenUsed="0" w:uiPriority="0" w:semiHidden="0" w:name="Table Theme"/>
+    <w:lsdException w:uiPriority="99" w:name="Table Theme"/>
     <w:lsdException w:unhideWhenUsed="0" w:uiPriority="60" w:semiHidden="0" w:name="Light Shading"/>
     <w:lsdException w:unhideWhenUsed="0" w:uiPriority="61" w:semiHidden="0" w:name="Light List"/>
     <w:lsdException w:unhideWhenUsed="0" w:uiPriority="62" w:semiHidden="0" w:name="Light Grid"/>
@@ -26143,12 +25932,16 @@
   <w:style w:type="character" w:default="1" w:styleId="8">
     <w:name w:val="Default Paragraph Font"/>
     <w:semiHidden/>
-    <w:uiPriority w:val="0"/>
+    <w:unhideWhenUsed/>
+    <w:qFormat/>
+    <w:uiPriority w:val="1"/>
   </w:style>
   <w:style w:type="table" w:default="1" w:styleId="6">
     <w:name w:val="Normal Table"/>
     <w:semiHidden/>
-    <w:uiPriority w:val="0"/>
+    <w:unhideWhenUsed/>
+    <w:qFormat/>
+    <w:uiPriority w:val="99"/>
     <w:tblPr>
       <w:tblCellMar>
         <w:top w:w="0" w:type="dxa"/>
@@ -26170,8 +25963,22 @@
     </w:pPr>
   </w:style>
   <w:style w:type="paragraph" w:styleId="3">
+    <w:name w:val="Balloon Text"/>
+    <w:basedOn w:val="1"/>
+    <w:link w:val="15"/>
+    <w:semiHidden/>
+    <w:unhideWhenUsed/>
+    <w:qFormat/>
+    <w:uiPriority w:val="99"/>
+    <w:rPr>
+      <w:sz w:val="18"/>
+      <w:szCs w:val="18"/>
+    </w:rPr>
+  </w:style>
+  <w:style w:type="paragraph" w:styleId="4">
     <w:name w:val="footer"/>
     <w:basedOn w:val="1"/>
+    <w:link w:val="10"/>
     <w:qFormat/>
     <w:uiPriority w:val="99"/>
     <w:pPr>
@@ -26187,49 +25994,27 @@
       <w:szCs w:val="18"/>
     </w:rPr>
   </w:style>
-  <w:style w:type="paragraph" w:styleId="4">
-    <w:name w:val="toc 1"/>
+  <w:style w:type="paragraph" w:styleId="5">
+    <w:name w:val="header"/>
     <w:basedOn w:val="1"/>
-    <w:next w:val="1"/>
+    <w:link w:val="12"/>
+    <w:unhideWhenUsed/>
     <w:qFormat/>
-    <w:uiPriority w:val="39"/>
+    <w:uiPriority w:val="99"/>
     <w:pPr>
+      <w:pBdr>
+        <w:bottom w:val="single" w:color="auto" w:sz="6" w:space="1"/>
+      </w:pBdr>
       <w:tabs>
-        <w:tab w:val="right" w:leader="dot" w:pos="8296"/>
-        <w:tab w:val="right" w:leader="dot" w:pos="8715"/>
+        <w:tab w:val="center" w:pos="4153"/>
+        <w:tab w:val="right" w:pos="8306"/>
       </w:tabs>
-      <w:jc w:val="left"/>
+      <w:snapToGrid w:val="0"/>
+      <w:jc w:val="center"/>
     </w:pPr>
     <w:rPr>
-      <w:rFonts w:ascii="Times New Roman" w:hAnsi="Times New Roman" w:eastAsia="Times New Roman" w:cs="宋体"/>
-      <w:b/>
-      <w:bCs/>
-      <w:caps/>
-      <w:kern w:val="0"/>
-      <w:sz w:val="28"/>
-      <w:szCs w:val="28"/>
-    </w:rPr>
-  </w:style>
-  <w:style w:type="paragraph" w:styleId="5">
-    <w:name w:val="toc 2"/>
-    <w:basedOn w:val="1"/>
-    <w:next w:val="1"/>
-    <w:uiPriority w:val="39"/>
-    <w:pPr>
-      <w:tabs>
-        <w:tab w:val="left" w:pos="840"/>
-        <w:tab w:val="right" w:leader="dot" w:pos="8296"/>
-      </w:tabs>
-      <w:ind w:firstLine="281" w:firstLineChars="100"/>
-      <w:jc w:val="left"/>
-    </w:pPr>
-    <w:rPr>
-      <w:rFonts w:ascii="仿宋_GB2312" w:hAnsi="仿宋" w:eastAsia="仿宋_GB2312" w:cs="宋体"/>
-      <w:b/>
-      <w:bCs/>
-      <w:smallCaps/>
-      <w:sz w:val="28"/>
-      <w:szCs w:val="28"/>
+      <w:sz w:val="18"/>
+      <w:szCs w:val="18"/>
     </w:rPr>
   </w:style>
   <w:style w:type="table" w:styleId="7">
@@ -26248,16 +26033,31 @@
       </w:tblBorders>
     </w:tblPr>
   </w:style>
-  <w:style w:type="paragraph" w:styleId="9">
-    <w:name w:val="List Paragraph"/>
-    <w:basedOn w:val="1"/>
+  <w:style w:type="character" w:customStyle="1" w:styleId="9">
+    <w:name w:val="页脚 字符"/>
+    <w:basedOn w:val="8"/>
+    <w:semiHidden/>
     <w:qFormat/>
-    <w:uiPriority w:val="34"/>
-    <w:pPr>
-      <w:ind w:firstLine="420" w:firstLineChars="200"/>
-    </w:pPr>
+    <w:uiPriority w:val="99"/>
+    <w:rPr>
+      <w:rFonts w:ascii="Times New Roman" w:hAnsi="Times New Roman" w:eastAsia="宋体" w:cs="Times New Roman"/>
+      <w:sz w:val="18"/>
+      <w:szCs w:val="18"/>
+    </w:rPr>
   </w:style>
-  <w:style w:type="paragraph" w:customStyle="1" w:styleId="10">
+  <w:style w:type="character" w:customStyle="1" w:styleId="10">
+    <w:name w:val="页脚 字符1"/>
+    <w:basedOn w:val="8"/>
+    <w:link w:val="4"/>
+    <w:qFormat/>
+    <w:uiPriority w:val="99"/>
+    <w:rPr>
+      <w:rFonts w:ascii="Times New Roman" w:hAnsi="Times New Roman" w:eastAsia="宋体" w:cs="Times New Roman"/>
+      <w:sz w:val="18"/>
+      <w:szCs w:val="18"/>
+    </w:rPr>
+  </w:style>
+  <w:style w:type="paragraph" w:customStyle="1" w:styleId="11">
     <w:name w:val="Default"/>
     <w:qFormat/>
     <w:uiPriority w:val="0"/>
@@ -26275,11 +26075,69 @@
       <w:lang w:val="en-US" w:eastAsia="zh-CN" w:bidi="ar-SA"/>
     </w:rPr>
   </w:style>
+  <w:style w:type="character" w:customStyle="1" w:styleId="12">
+    <w:name w:val="页眉 字符"/>
+    <w:basedOn w:val="8"/>
+    <w:link w:val="5"/>
+    <w:qFormat/>
+    <w:uiPriority w:val="99"/>
+    <w:rPr>
+      <w:rFonts w:ascii="Times New Roman" w:hAnsi="Times New Roman" w:eastAsia="宋体" w:cs="Times New Roman"/>
+      <w:sz w:val="18"/>
+      <w:szCs w:val="18"/>
+    </w:rPr>
+  </w:style>
+  <w:style w:type="paragraph" w:styleId="13">
+    <w:name w:val="List Paragraph"/>
+    <w:basedOn w:val="1"/>
+    <w:link w:val="14"/>
+    <w:qFormat/>
+    <w:uiPriority w:val="34"/>
+    <w:pPr>
+      <w:ind w:firstLine="420" w:firstLineChars="200"/>
+    </w:pPr>
+  </w:style>
+  <w:style w:type="character" w:customStyle="1" w:styleId="14">
+    <w:name w:val="列出段落 字符"/>
+    <w:link w:val="13"/>
+    <w:qFormat/>
+    <w:uiPriority w:val="34"/>
+    <w:rPr>
+      <w:rFonts w:ascii="Times New Roman" w:hAnsi="Times New Roman" w:eastAsia="宋体" w:cs="Times New Roman"/>
+      <w:szCs w:val="24"/>
+    </w:rPr>
+  </w:style>
+  <w:style w:type="character" w:customStyle="1" w:styleId="15">
+    <w:name w:val="批注框文本 字符"/>
+    <w:basedOn w:val="8"/>
+    <w:link w:val="3"/>
+    <w:semiHidden/>
+    <w:qFormat/>
+    <w:uiPriority w:val="99"/>
+    <w:rPr>
+      <w:rFonts w:ascii="Times New Roman" w:hAnsi="Times New Roman" w:eastAsia="宋体" w:cs="Times New Roman"/>
+      <w:kern w:val="2"/>
+      <w:sz w:val="18"/>
+      <w:szCs w:val="18"/>
+    </w:rPr>
+  </w:style>
+  <w:style w:type="character" w:customStyle="1" w:styleId="16">
+    <w:name w:val="fontstyle01"/>
+    <w:basedOn w:val="8"/>
+    <w:qFormat/>
+    <w:uiPriority w:val="0"/>
+    <w:rPr>
+      <w:rFonts w:ascii="宋体" w:hAnsi="宋体" w:eastAsia="宋体" w:cs="宋体"/>
+      <w:color w:val="000000"/>
+      <w:sz w:val="24"/>
+      <w:szCs w:val="24"/>
+    </w:rPr>
+  </w:style>
 </w:styles>
 </file>
 
 <file path=word/theme/theme1.xml><?xml version="1.0" encoding="utf-8"?>
-<a:theme xmlns:a="http://schemas.openxmlformats.org/drawingml/2006/main" name="Office 主题">
+<a:theme xmlns:a="http://schemas.openxmlformats.org/drawingml/2006/main" name="Office 主题​​">
   <a:themeElements>
     <a:clrScheme name="Office">
       <a:dk1>
@@ -26321,12 +26179,12 @@
     </a:clrScheme>
     <a:fontScheme name="Office">
       <a:majorFont>
-        <a:latin typeface="Calibri Light"/>
+        <a:latin typeface="等线 Light"/>
         <a:ea typeface=""/>
         <a:cs typeface=""/>
-        <a:font script="Jpan" typeface="ＭＳ ゴシック"/>
+        <a:font script="Jpan" typeface="游ゴシック Light"/>
         <a:font script="Hang" typeface="맑은 고딕"/>
-        <a:font script="Hans" typeface="宋体"/>
+        <a:font script="Hans" typeface="等线 Light"/>
         <a:font script="Hant" typeface="新細明體"/>
         <a:font script="Arab" typeface="Times New Roman"/>
         <a:font script="Hebr" typeface="Times New Roman"/>
@@ -26356,12 +26214,12 @@
         <a:font script="Geor" typeface="Sylfaen"/>
       </a:majorFont>
       <a:minorFont>
-        <a:latin typeface="Calibri"/>
+        <a:latin typeface="等线"/>
         <a:ea typeface=""/>
         <a:cs typeface=""/>
-        <a:font script="Jpan" typeface="ＭＳ 明朝"/>
+        <a:font script="Jpan" typeface="游明朝"/>
         <a:font script="Hang" typeface="맑은 고딕"/>
-        <a:font script="Hans" typeface="宋体"/>
+        <a:font script="Hans" typeface="等线"/>
         <a:font script="Hant" typeface="新細明體"/>
         <a:font script="Arab" typeface="Arial"/>
         <a:font script="Hebr" typeface="Arial"/>
@@ -26546,10 +26404,20 @@
 </s:customData>
 </file>
 
+<file path=customXml/item2.xml><?xml version="1.0" encoding="utf-8"?>
+<b:Sources xmlns:b="http://schemas.openxmlformats.org/officeDocument/2006/bibliography" xmlns="http://schemas.openxmlformats.org/officeDocument/2006/bibliography" SelectedStyle="\APA.XSL" StyleName="APA Fifth Edition"/>
+</file>
+
 <file path=customXml/itemProps1.xml><?xml version="1.0" encoding="utf-8"?>
 <ds:datastoreItem xmlns:ds="http://schemas.openxmlformats.org/officeDocument/2006/customXml" ds:itemID="{B1977F7D-205B-4081-913C-38D41E755F92}">
   <ds:schemaRefs>
     <ds:schemaRef ds:uri="http://www.wps.cn/officeDocument/2013/wpsCustomData"/>
   </ds:schemaRefs>
 </ds:datastoreItem>
+</file>
+
+<file path=customXml/itemProps2.xml><?xml version="1.0" encoding="utf-8"?>
+<ds:datastoreItem xmlns:ds="http://schemas.openxmlformats.org/officeDocument/2006/customXml" ds:itemID="{DB487932-06B3-4BAE-BA72-D8BE776DE7FA}">
+  <ds:schemaRefs/>
+</ds:datastoreItem>
 </file>
</xml_diff>